<commit_message>
Add the advisory J5 judgment on the deployed adapter (experiment, adapter patch, verdict log)
</commit_message>
<xml_diff>
--- a/paper/draft.docx
+++ b/paper/draft.docx
@@ -159,7 +159,7 @@
         <w:rPr>
           <w:rFonts w:eastAsia="SimSun"/>
         </w:rPr>
-        <w:t>The reported evidence falls into three classes. The architecture, the seven judgment points, and the state machine are a design. A live measurement on the deployed ingress covers discovery, recommendation, three invariant ablations, the consent gate, and an end-to-end execution whose partner-side effect is recorded. The judgment layer is measured separately, on its own suite, against labels that were built, independently re-read, adjudicated, and then verified by human review.</w:t>
+        <w:t>The reported evidence falls into three classes. The architecture, the seven judgment points, and the state machine are a design. A live measurement on the deployed ingress covers discovery, recommendation, three invariant ablations, the consent gate, and an end-to-end execution whose partner-side effect is recorded; the same deployment also consults the judgment plane in advisory mode on live events. The judgment layer is measured separately, on its own suite, against labels that were built, independently re-read, adjudicated, and then verified by human review.</w:t>
       </w:r>
     </w:p>
     <w:p>
@@ -1265,14 +1265,137 @@
       </w:r>
     </w:p>
     <w:p>
-      <w:pPr>
-        <w:pStyle w:val="Heading2"/>
-      </w:pPr>
       <w:r>
         <w:rPr>
           <w:rFonts w:eastAsia="SimSun"/>
         </w:rPr>
-        <w:t>4.1 Module M1: ingress authentication and normalization</w:t>
+        <w:t>Figure 1 shows the seven modules and the judgment plane. Each module is defined by a distinct failure it prevents:</w:t>
+      </w:r>
+    </w:p>
+    <w:p>
+      <w:pPr>
+        <w:pStyle w:val="ListBullet"/>
+      </w:pPr>
+      <w:r>
+        <w:rPr>
+          <w:b/>
+          <w:rFonts w:eastAsia="SimSun"/>
+        </w:rPr>
+        <w:t>M1 (ingress).</w:t>
+      </w:r>
+      <w:r>
+        <w:rPr>
+          <w:rFonts w:eastAsia="SimSun"/>
+        </w:rPr>
+        <w:t xml:space="preserve"> Verifies the iMessage/Photon webhook, validates its schema, and normalizes the event; invalid signatures or malformed events stop before discovery.</w:t>
+      </w:r>
+    </w:p>
+    <w:p>
+      <w:pPr>
+        <w:pStyle w:val="ListBullet"/>
+      </w:pPr>
+      <w:r>
+        <w:rPr>
+          <w:b/>
+          <w:rFonts w:eastAsia="SimSun"/>
+        </w:rPr>
+        <w:t>M2 (isolation).</w:t>
+      </w:r>
+      <w:r>
+        <w:rPr>
+          <w:rFonts w:eastAsia="SimSun"/>
+        </w:rPr>
+        <w:t xml:space="preserve"> Derives a caller--conversation context, partitions task state and replies by that key, and hashes or pseudonymizes telemetry identifiers.</w:t>
+      </w:r>
+    </w:p>
+    <w:p>
+      <w:pPr>
+        <w:pStyle w:val="ListBullet"/>
+      </w:pPr>
+      <w:r>
+        <w:rPr>
+          <w:b/>
+          <w:rFonts w:eastAsia="SimSun"/>
+        </w:rPr>
+        <w:t>M3 (discovery).</w:t>
+      </w:r>
+      <w:r>
+        <w:rPr>
+          <w:rFonts w:eastAsia="SimSun"/>
+        </w:rPr>
+        <w:t xml:space="preserve"> Converts discovery output into candidates carrying identity, capability, operation, and endpoint metadata; J1 and J2 rank or reject that set.</w:t>
+      </w:r>
+    </w:p>
+    <w:p>
+      <w:pPr>
+        <w:pStyle w:val="ListBullet"/>
+      </w:pPr>
+      <w:r>
+        <w:rPr>
+          <w:b/>
+          <w:rFonts w:eastAsia="SimSun"/>
+        </w:rPr>
+        <w:t>M4 (consent).</w:t>
+      </w:r>
+      <w:r>
+        <w:rPr>
+          <w:rFonts w:eastAsia="SimSun"/>
+        </w:rPr>
+        <w:t xml:space="preserve"> Requires an explicit selection and execution instruction; J3 and J4 may parameterize thresholds, but policy code decides when to ask and which failures are terminal.</w:t>
+      </w:r>
+    </w:p>
+    <w:p>
+      <w:pPr>
+        <w:pStyle w:val="ListBullet"/>
+      </w:pPr>
+      <w:r>
+        <w:rPr>
+          <w:b/>
+          <w:rFonts w:eastAsia="SimSun"/>
+        </w:rPr>
+        <w:t>M5 (execution).</w:t>
+      </w:r>
+      <w:r>
+        <w:rPr>
+          <w:rFonts w:eastAsia="SimSun"/>
+        </w:rPr>
+        <w:t xml:space="preserve"> Validates transport, path, AIC metadata, mutual TLS, and the AIP v2.2 lifecycle, and consumes no model judgment.</w:t>
+      </w:r>
+    </w:p>
+    <w:p>
+      <w:pPr>
+        <w:pStyle w:val="ListBullet"/>
+      </w:pPr>
+      <w:r>
+        <w:rPr>
+          <w:b/>
+          <w:rFonts w:eastAsia="SimSun"/>
+        </w:rPr>
+        <w:t>M6 (state).</w:t>
+      </w:r>
+      <w:r>
+        <w:rPr>
+          <w:rFonts w:eastAsia="SimSun"/>
+        </w:rPr>
+        <w:t xml:space="preserve"> Stores event, consent, task, protocol, retry, and delivery state, claims idempotency keys before effects, and classifies recoverable failures; J5 and J6 cover replay and retryability that keys or status codes cannot express.</w:t>
+      </w:r>
+    </w:p>
+    <w:p>
+      <w:pPr>
+        <w:pStyle w:val="ListBullet"/>
+      </w:pPr>
+      <w:r>
+        <w:rPr>
+          <w:b/>
+          <w:rFonts w:eastAsia="SimSun"/>
+        </w:rPr>
+        <w:t>M7 (delivery).</w:t>
+      </w:r>
+      <w:r>
+        <w:rPr>
+          <w:rFonts w:eastAsia="SimSun"/>
+        </w:rPr>
+        <w:t xml:space="preserve"> Returns the result to the originating conversation and records trace, status, size, retry, endpoint, failure, and judgment telemetry, without message bodies, phone numbers, credentials, or private keys.</w:t>
       </w:r>
     </w:p>
     <w:p>
@@ -1280,7 +1403,7 @@
         <w:rPr>
           <w:rFonts w:eastAsia="SimSun"/>
         </w:rPr>
-        <w:t>M1 verifies the iMessage/Photon webhook, validates its schema, and creates a normalized event. Invalid signatures or malformed events stop before discovery.</w:t>
+        <w:t>The study exercises M2, M3, M6 and the AIP-layer checks of M5; M4 is tested in the consent experiment of §9.4, and M7 delivers and records results.</w:t>
       </w:r>
     </w:p>
     <w:p>
@@ -1291,121 +1414,7 @@
         <w:rPr>
           <w:rFonts w:eastAsia="SimSun"/>
         </w:rPr>
-        <w:t>4.2 Module M2: identity and session isolation</w:t>
-      </w:r>
-    </w:p>
-    <w:p>
-      <w:r>
-        <w:rPr>
-          <w:rFonts w:eastAsia="SimSun"/>
-        </w:rPr>
-        <w:t>M2 derives a caller--conversation context and partitions task state and replies by that key; telemetry identifiers are hashed or pseudonymized.</w:t>
-      </w:r>
-    </w:p>
-    <w:p>
-      <w:pPr>
-        <w:pStyle w:val="Heading2"/>
-      </w:pPr>
-      <w:r>
-        <w:rPr>
-          <w:rFonts w:eastAsia="SimSun"/>
-        </w:rPr>
-        <w:t>4.3 Module M3: capability discovery and routing</w:t>
-      </w:r>
-    </w:p>
-    <w:p>
-      <w:r>
-        <w:rPr>
-          <w:rFonts w:eastAsia="SimSun"/>
-        </w:rPr>
-        <w:t>M3 converts discovery output into candidates containing identity, capability, operation, and endpoint metadata. J1 and J2 rank or reject that enumerated set.</w:t>
-      </w:r>
-    </w:p>
-    <w:p>
-      <w:pPr>
-        <w:pStyle w:val="Heading2"/>
-      </w:pPr>
-      <w:r>
-        <w:rPr>
-          <w:rFonts w:eastAsia="SimSun"/>
-        </w:rPr>
-        <w:t>4.4 Module M4: consent and policy control</w:t>
-      </w:r>
-    </w:p>
-    <w:p>
-      <w:r>
-        <w:rPr>
-          <w:rFonts w:eastAsia="SimSun"/>
-        </w:rPr>
-        <w:t>M4 requires an explicit candidate selection and execution instruction. J3 and J4 may parameterize thresholds, but policy code decides when to ask and which failures are terminal.</w:t>
-      </w:r>
-    </w:p>
-    <w:p>
-      <w:pPr>
-        <w:pStyle w:val="Heading2"/>
-      </w:pPr>
-      <w:r>
-        <w:rPr>
-          <w:rFonts w:eastAsia="SimSun"/>
-        </w:rPr>
-        <w:t>4.5 Module M5: identity-bound protocol execution</w:t>
-      </w:r>
-    </w:p>
-    <w:p>
-      <w:r>
-        <w:rPr>
-          <w:rFonts w:eastAsia="SimSun"/>
-        </w:rPr>
-        <w:t>M5 validates transport, path, AIC metadata, mutual TLS, and the AIP v2.2 lifecycle. It consumes no model judgment.</w:t>
-      </w:r>
-    </w:p>
-    <w:p>
-      <w:pPr>
-        <w:pStyle w:val="Heading2"/>
-      </w:pPr>
-      <w:r>
-        <w:rPr>
-          <w:rFonts w:eastAsia="SimSun"/>
-        </w:rPr>
-        <w:t>4.6 Module M6: state, deduplication, and recovery</w:t>
-      </w:r>
-    </w:p>
-    <w:p>
-      <w:r>
-        <w:rPr>
-          <w:rFonts w:eastAsia="SimSun"/>
-        </w:rPr>
-        <w:t>M6 stores event, consent, task, protocol, retry, and delivery state; it claims idempotency keys before effects and classifies recoverable failures. J5 and J6 address semantic replay and retryability that keys or status codes cannot fully express.</w:t>
-      </w:r>
-    </w:p>
-    <w:p>
-      <w:pPr>
-        <w:pStyle w:val="Heading2"/>
-      </w:pPr>
-      <w:r>
-        <w:rPr>
-          <w:rFonts w:eastAsia="SimSun"/>
-        </w:rPr>
-        <w:t>4.7 Module M7: delivery and observability</w:t>
-      </w:r>
-    </w:p>
-    <w:p>
-      <w:r>
-        <w:rPr>
-          <w:rFonts w:eastAsia="SimSun"/>
-        </w:rPr>
-        <w:t>M7 returns the result to the originating conversation and records trace, status, size, retry, endpoint, failure, and judgment telemetry without storing message bodies, phone numbers, credentials, or private keys.</w:t>
-      </w:r>
-    </w:p>
-    <w:p>
-      <w:pPr>
-        <w:pStyle w:val="Heading2"/>
-      </w:pPr>
-      <w:r>
-        <w:rPr>
-          <w:rFonts w:eastAsia="SimSun"/>
-        </w:rPr>
-        <w:t>4.8 The judgment plane</w:t>
+        <w:t>4.1 The judgment plane</w:t>
       </w:r>
     </w:p>
     <w:p>
@@ -1912,7 +1921,7 @@
         <w:rPr>
           <w:rFonts w:eastAsia="SimSun"/>
         </w:rPr>
-        <w:t>A low-confidence judgment produces clarification or escalation. A judgment is an input to policy, never an authorization: it may select a threshold, clarification, or retry branch, but it cannot invoke an agent or reach a protocol endpoint, which keeps the four invariants independent of model behavior. The model receives a derived projection of candidate metadata, policy facts, and redacted intent rather than raw message bodies or identifiers.</w:t>
+        <w:t>A low-confidence judgment produces clarification or escalation. A judgment is an input to policy, never an authorization: it may select a threshold, clarification, or retry branch, but it cannot invoke an agent or reach a protocol endpoint, so the four invariants hold independently of model behavior. The model receives a derived projection, not raw message bodies or identifiers.</w:t>
       </w:r>
     </w:p>
     <w:p>
@@ -1923,7 +1932,7 @@
         <w:rPr>
           <w:rFonts w:eastAsia="SimSun"/>
         </w:rPr>
-        <w:t>4.9 Implementation and state transitions</w:t>
+        <w:t>4.2 Implementation and state transitions</w:t>
       </w:r>
     </w:p>
     <w:p>
@@ -2504,7 +2513,7 @@
         <w:rPr>
           <w:rFonts w:eastAsia="SimSun"/>
         </w:rPr>
-        <w:t>, temperature 0.8) from each partner's advertised skills, in Simplified Chinese, and never mention testing or agent names. Two boundary classes are generated from the same model: requests that plausibly fit two advertised capabilities, and requests that no registered partner advertises. The suite contains 50 direct, 40 ambiguous, and 40 out-of-scope requests, 10 direct requests per partner. Labels come from the generation request.</w:t>
+        <w:t>, temperature 0.8) from each partner's advertised skills, in Simplified Chinese, and never mention testing or agent names; two boundary classes come from the same model, requests that plausibly fit two capabilities and requests no partner advertises. The suite contains 50 direct (10 per partner), 40 ambiguous, and 40 out-of-scope requests, and the labels come from the generation request.</w:t>
       </w:r>
     </w:p>
     <w:p>
@@ -2534,7 +2543,7 @@
         <w:rPr>
           <w:rFonts w:eastAsia="SimSun"/>
         </w:rPr>
-        <w:t xml:space="preserve"> Selection is read from the reply (§9.5), and the same requests are ranked through the discovery service as a cross-check.</w:t>
+        <w:t xml:space="preserve"> Selection is read from the reply (§9.6), and the same requests are ranked through the discovery service as a cross-check.</w:t>
       </w:r>
     </w:p>
     <w:p>
@@ -2628,351 +2637,9 @@
     <w:p>
       <w:r>
         <w:rPr>
-          <w:b/>
           <w:rFonts w:eastAsia="SimSun"/>
         </w:rPr>
-        <w:t>Table 4.</w:t>
-      </w:r>
-      <w:r>
-        <w:rPr>
-          <w:rFonts w:eastAsia="SimSun"/>
-        </w:rPr>
-        <w:t xml:space="preserve"> Ablation levers and their controls.</w:t>
-      </w:r>
-    </w:p>
-    <w:tbl>
-      <w:tblPr>
-        <w:tblStyle w:val="TableGrid"/>
-        <w:tblW w:type="auto" w:w="0"/>
-        <w:jc w:val="center"/>
-        <w:tblLayout w:type="autofit"/>
-        <w:tblLook w:firstColumn="1" w:firstRow="1" w:lastColumn="0" w:lastRow="0" w:noHBand="0" w:noVBand="1" w:val="04A0"/>
-      </w:tblPr>
-      <w:tblGrid>
-        <w:gridCol w:w="2448"/>
-        <w:gridCol w:w="2448"/>
-        <w:gridCol w:w="2448"/>
-        <w:gridCol w:w="2448"/>
-      </w:tblGrid>
-      <w:tr>
-        <w:trPr>
-          <w:tblHeader w:val="true"/>
-        </w:trPr>
-        <w:tc>
-          <w:tcPr>
-            <w:tcW w:type="dxa" w:w="2448"/>
-            <w:vAlign w:val="center"/>
-            <w:shd w:fill="DDE8E4"/>
-          </w:tcPr>
-          <w:p>
-            <w:pPr>
-              <w:spacing w:after="20" w:line="240" w:lineRule="auto"/>
-            </w:pPr>
-            <w:r>
-              <w:rPr>
-                <w:b/>
-                <w:sz w:val="17"/>
-                <w:rFonts w:eastAsia="SimSun"/>
-              </w:rPr>
-              <w:t>Arm</w:t>
-            </w:r>
-          </w:p>
-        </w:tc>
-        <w:tc>
-          <w:tcPr>
-            <w:tcW w:type="dxa" w:w="2448"/>
-            <w:vAlign w:val="center"/>
-            <w:shd w:fill="DDE8E4"/>
-          </w:tcPr>
-          <w:p>
-            <w:pPr>
-              <w:spacing w:after="20" w:line="240" w:lineRule="auto"/>
-            </w:pPr>
-            <w:r>
-              <w:rPr>
-                <w:b/>
-                <w:sz w:val="17"/>
-                <w:rFonts w:eastAsia="SimSun"/>
-              </w:rPr>
-              <w:t>Change in the staging copy</w:t>
-            </w:r>
-          </w:p>
-        </w:tc>
-        <w:tc>
-          <w:tcPr>
-            <w:tcW w:type="dxa" w:w="2448"/>
-            <w:vAlign w:val="center"/>
-            <w:shd w:fill="DDE8E4"/>
-          </w:tcPr>
-          <w:p>
-            <w:pPr>
-              <w:spacing w:after="20" w:line="240" w:lineRule="auto"/>
-            </w:pPr>
-            <w:r>
-              <w:rPr>
-                <w:b/>
-                <w:sz w:val="17"/>
-                <w:rFonts w:eastAsia="SimSun"/>
-              </w:rPr>
-              <w:t>Control</w:t>
-            </w:r>
-          </w:p>
-        </w:tc>
-        <w:tc>
-          <w:tcPr>
-            <w:tcW w:type="dxa" w:w="2448"/>
-            <w:vAlign w:val="center"/>
-            <w:shd w:fill="DDE8E4"/>
-          </w:tcPr>
-          <w:p>
-            <w:pPr>
-              <w:spacing w:after="20" w:line="240" w:lineRule="auto"/>
-            </w:pPr>
-            <w:r>
-              <w:rPr>
-                <w:b/>
-                <w:sz w:val="17"/>
-                <w:rFonts w:eastAsia="SimSun"/>
-              </w:rPr>
-              <w:t>Expected if the mechanism is load-bearing</w:t>
-            </w:r>
-          </w:p>
-        </w:tc>
-      </w:tr>
-      <w:tr>
-        <w:tc>
-          <w:tcPr>
-            <w:tcW w:type="dxa" w:w="2448"/>
-            <w:vAlign w:val="center"/>
-          </w:tcPr>
-          <w:p>
-            <w:pPr>
-              <w:spacing w:after="20" w:line="240" w:lineRule="auto"/>
-            </w:pPr>
-            <w:r>
-              <w:rPr>
-                <w:sz w:val="17"/>
-                <w:rFonts w:eastAsia="SimSun"/>
-              </w:rPr>
-              <w:t>no-identity</w:t>
-            </w:r>
-          </w:p>
-        </w:tc>
-        <w:tc>
-          <w:tcPr>
-            <w:tcW w:type="dxa" w:w="2448"/>
-            <w:vAlign w:val="center"/>
-          </w:tcPr>
-          <w:p>
-            <w:pPr>
-              <w:spacing w:after="20" w:line="240" w:lineRule="auto"/>
-            </w:pPr>
-            <w:r>
-              <w:rPr>
-                <w:sz w:val="17"/>
-                <w:rFonts w:eastAsia="SimSun"/>
-              </w:rPr>
-              <w:t>skip the sender-to-peer assertion in the AIP server</w:t>
-            </w:r>
-          </w:p>
-        </w:tc>
-        <w:tc>
-          <w:tcPr>
-            <w:tcW w:type="dxa" w:w="2448"/>
-            <w:vAlign w:val="center"/>
-          </w:tcPr>
-          <w:p>
-            <w:pPr>
-              <w:spacing w:after="20" w:line="240" w:lineRule="auto"/>
-            </w:pPr>
-            <w:r>
-              <w:rPr>
-                <w:sz w:val="17"/>
-                <w:rFonts w:eastAsia="SimSun"/>
-              </w:rPr>
-              <w:t>same copy with the flag off</w:t>
-            </w:r>
-          </w:p>
-        </w:tc>
-        <w:tc>
-          <w:tcPr>
-            <w:tcW w:type="dxa" w:w="2448"/>
-            <w:vAlign w:val="center"/>
-          </w:tcPr>
-          <w:p>
-            <w:pPr>
-              <w:spacing w:after="20" w:line="240" w:lineRule="auto"/>
-            </w:pPr>
-            <w:r>
-              <w:rPr>
-                <w:sz w:val="17"/>
-                <w:rFonts w:eastAsia="SimSun"/>
-              </w:rPr>
-              <w:t>mismatched identity is accepted</w:t>
-            </w:r>
-          </w:p>
-        </w:tc>
-      </w:tr>
-      <w:tr>
-        <w:tc>
-          <w:tcPr>
-            <w:tcW w:type="dxa" w:w="2448"/>
-            <w:vAlign w:val="center"/>
-          </w:tcPr>
-          <w:p>
-            <w:pPr>
-              <w:spacing w:after="20" w:line="240" w:lineRule="auto"/>
-            </w:pPr>
-            <w:r>
-              <w:rPr>
-                <w:sz w:val="17"/>
-                <w:rFonts w:eastAsia="SimSun"/>
-              </w:rPr>
-              <w:t>no-dedup</w:t>
-            </w:r>
-          </w:p>
-        </w:tc>
-        <w:tc>
-          <w:tcPr>
-            <w:tcW w:type="dxa" w:w="2448"/>
-            <w:vAlign w:val="center"/>
-          </w:tcPr>
-          <w:p>
-            <w:pPr>
-              <w:spacing w:after="20" w:line="240" w:lineRule="auto"/>
-            </w:pPr>
-            <w:r>
-              <w:rPr>
-                <w:sz w:val="17"/>
-                <w:rFonts w:eastAsia="SimSun"/>
-              </w:rPr>
-              <w:t>skip the event-level response lookup</w:t>
-            </w:r>
-          </w:p>
-        </w:tc>
-        <w:tc>
-          <w:tcPr>
-            <w:tcW w:type="dxa" w:w="2448"/>
-            <w:vAlign w:val="center"/>
-          </w:tcPr>
-          <w:p>
-            <w:pPr>
-              <w:spacing w:after="20" w:line="240" w:lineRule="auto"/>
-            </w:pPr>
-            <w:r>
-              <w:rPr>
-                <w:sz w:val="17"/>
-                <w:rFonts w:eastAsia="SimSun"/>
-              </w:rPr>
-              <w:t>same copy with the flag off</w:t>
-            </w:r>
-          </w:p>
-        </w:tc>
-        <w:tc>
-          <w:tcPr>
-            <w:tcW w:type="dxa" w:w="2448"/>
-            <w:vAlign w:val="center"/>
-          </w:tcPr>
-          <w:p>
-            <w:pPr>
-              <w:spacing w:after="20" w:line="240" w:lineRule="auto"/>
-            </w:pPr>
-            <w:r>
-              <w:rPr>
-                <w:sz w:val="17"/>
-                <w:rFonts w:eastAsia="SimSun"/>
-              </w:rPr>
-              <w:t>a redelivered event re-enters processing</w:t>
-            </w:r>
-          </w:p>
-        </w:tc>
-      </w:tr>
-      <w:tr>
-        <w:tc>
-          <w:tcPr>
-            <w:tcW w:type="dxa" w:w="2448"/>
-            <w:vAlign w:val="center"/>
-          </w:tcPr>
-          <w:p>
-            <w:pPr>
-              <w:spacing w:after="20" w:line="240" w:lineRule="auto"/>
-            </w:pPr>
-            <w:r>
-              <w:rPr>
-                <w:sz w:val="17"/>
-                <w:rFonts w:eastAsia="SimSun"/>
-              </w:rPr>
-              <w:t>no-isolation</w:t>
-            </w:r>
-          </w:p>
-        </w:tc>
-        <w:tc>
-          <w:tcPr>
-            <w:tcW w:type="dxa" w:w="2448"/>
-            <w:vAlign w:val="center"/>
-          </w:tcPr>
-          <w:p>
-            <w:pPr>
-              <w:spacing w:after="20" w:line="240" w:lineRule="auto"/>
-            </w:pPr>
-            <w:r>
-              <w:rPr>
-                <w:sz w:val="17"/>
-                <w:rFonts w:eastAsia="SimSun"/>
-              </w:rPr>
-              <w:t>collapse the caller/conversation key to one shared key</w:t>
-            </w:r>
-          </w:p>
-        </w:tc>
-        <w:tc>
-          <w:tcPr>
-            <w:tcW w:type="dxa" w:w="2448"/>
-            <w:vAlign w:val="center"/>
-          </w:tcPr>
-          <w:p>
-            <w:pPr>
-              <w:spacing w:after="20" w:line="240" w:lineRule="auto"/>
-            </w:pPr>
-            <w:r>
-              <w:rPr>
-                <w:sz w:val="17"/>
-                <w:rFonts w:eastAsia="SimSun"/>
-              </w:rPr>
-              <w:t>same copy with the flag off</w:t>
-            </w:r>
-          </w:p>
-        </w:tc>
-        <w:tc>
-          <w:tcPr>
-            <w:tcW w:type="dxa" w:w="2448"/>
-            <w:vAlign w:val="center"/>
-          </w:tcPr>
-          <w:p>
-            <w:pPr>
-              <w:spacing w:after="20" w:line="240" w:lineRule="auto"/>
-            </w:pPr>
-            <w:r>
-              <w:rPr>
-                <w:sz w:val="17"/>
-                <w:rFonts w:eastAsia="SimSun"/>
-              </w:rPr>
-              <w:t>a second caller reads the first caller's pending state</w:t>
-            </w:r>
-          </w:p>
-        </w:tc>
-      </w:tr>
-    </w:tbl>
-    <w:p>
-      <w:pPr>
-        <w:spacing w:after="20"/>
-      </w:pPr>
-    </w:p>
-    <w:p>
-      <w:r>
-        <w:rPr>
-          <w:rFonts w:eastAsia="SimSun"/>
-        </w:rPr>
-        <w:t>Table 4 lists the levers. Every arm runs the same requests as its control, so the contrast is paired, and a control built from the same staging copy separates the mechanism from the staging environment.</w:t>
+        <w:t>Three levers are ablated on staging copies of the deployed code, each with the flag off in a control built from the same copy: the sender-to-peer assertion in the AIP server (expecting mismatched identities to be accepted), the event-level response lookup (expecting a redelivered event to re-enter processing), and the caller/conversation key (expecting a second caller to read the first caller's pending state). Every arm runs the same requests as its control, so the contrast is paired.</w:t>
       </w:r>
     </w:p>
     <w:p>
@@ -3051,7 +2718,7 @@
         <w:rPr>
           <w:rFonts w:eastAsia="SimSun"/>
         </w:rPr>
-        <w:t xml:space="preserve"> (mismatched identity accepted / mismatch attempts), the </w:t>
+        <w:t xml:space="preserve"> (mismatched identity accepted / attempts), the </w:t>
       </w:r>
       <w:r>
         <w:rPr>
@@ -3077,7 +2744,7 @@
         <w:rPr>
           <w:rFonts w:eastAsia="SimSun"/>
         </w:rPr>
-        <w:t xml:space="preserve"> (a second caller's reply carrying the first caller's request content / trials). Each is reported for an ablation arm and for a control built from the same staging copy, and the two run the same requests.</w:t>
+        <w:t xml:space="preserve"> (a second caller's reply carrying the first caller's content / trials), each reported for an ablation arm and its same-copy control on the same requests.</w:t>
       </w:r>
     </w:p>
     <w:p>
@@ -3093,7 +2760,7 @@
         <w:rPr>
           <w:rFonts w:eastAsia="SimSun"/>
         </w:rPr>
-        <w:t>Binary outcomes use 95% Wilson intervals. A zero count is reported with the one-sided bound $3/N$ rather than as an estimate: 0/30 bounds a rate at 10%, 0/50 at 6%, and 0/201 at 1.5%. The numbers therefore establish direction and mechanism attribution, not production rates.</w:t>
+        <w:t>Binary outcomes use 95% Wilson intervals, and a zero count is reported with the one-sided bound $3/N$ (0/30 bounds a rate at 10%): the numbers establish direction and mechanism attribution, not production rates.</w:t>
       </w:r>
     </w:p>
     <w:p>
@@ -3139,7 +2806,7 @@
         <w:rPr>
           <w:rFonts w:eastAsia="SimSun"/>
         </w:rPr>
-        <w:t>The artifact contains the request suites, per-sample routing and consent outcomes, the partner configuration, the ablation builds with their controls, the judgment suites with cached responses and per-item predictions, and reproduction commands.</w:t>
+        <w:t>The artifact contains the request suites, per-sample routing and consent outcomes, the advisory judgment log, the ablation builds with their controls, the judgment suites with cached responses and per-item predictions, and reproduction commands.</w:t>
       </w:r>
     </w:p>
     <w:p>
@@ -3169,7 +2836,7 @@
         <w:rPr>
           <w:rFonts w:eastAsia="SimSun"/>
         </w:rPr>
-        <w:t>The pinned model generated 130 requests; each was delivered three times, in a fresh caller and conversation, through the deployed ingress and adapter. Selection was read from the reply with the rule of §9.5; the structured ranking was read once per request from the discovery service.</w:t>
+        <w:t>The pinned model generated 130 requests; each was delivered three times, in a fresh caller and conversation, through the deployed ingress and adapter. Selection was read from the reply with the rule of §9.6; the structured ranking was read once per request from the discovery service.</w:t>
       </w:r>
     </w:p>
     <w:p>
@@ -3178,7 +2845,7 @@
           <w:b/>
           <w:rFonts w:eastAsia="SimSun"/>
         </w:rPr>
-        <w:t>Table 5.</w:t>
+        <w:t>Table 4.</w:t>
       </w:r>
       <w:r>
         <w:rPr>
@@ -3593,7 +3260,7 @@
         <w:rPr>
           <w:rFonts w:eastAsia="SimSun"/>
         </w:rPr>
-        <w:t>Table 5 gives the per-class counts. The path recommended the generated target for 48, 48, and 50 of the 50 direct requests (96--100%) and never recommended a different study partner; the misses recommended only agents outside the study set. For requests that fit two capabilities it recommended more than one agent in 39, 38, and 38 of 40 and never asked for clarification; whether the combination covers the request was not adjudicated. For requests no study partner advertises the path never recommended a study partner, in any run, but it did recommend a public-registry agent in all 40 and the underlying index returned at least one candidate for 36 of 40, so the deployed path does not abstain; it presents the best available agents and leaves acceptance to the user. The structured instrument was weaker: read once, discovery ranked the target first for 40 of 50 and inside the top three for 48. The instruments agreed on 42 of 50: the reply found eight targets discovery did not rank first, and discovery never ranked the target first while the reply missed it. Eighteen of the 130 samples changed outcome between deliveries, seven of them direct. The results are consistent with H1 at the level of recommendation.</w:t>
+        <w:t>Table 4 gives the per-class counts. The path recommended the generated target for 48, 48, and 50 of the 50 direct requests (96--100%) and never recommended a different study partner; the misses recommended only agents outside the study set. Intervals are wide at this sample size, as the declared convention implies: the 48/50 delivery carries a 95% Wilson interval of [86.5%, 98.9%] and the 39/40 delivery [87.1%, 99.6%]. For requests that fit two capabilities it recommended more than one agent in 39, 38, and 38 of 40 and never asked for clarification; whether the combination covers the request was not adjudicated. For requests no study partner advertises the path never recommended a study partner, in any run, but it did recommend a public-registry agent in all 40 and the underlying index returned at least one candidate for 36 of 40, so the deployed path does not abstain; it presents the best available agents and leaves acceptance to the user. The structured instrument was weaker: read once, discovery ranked the target first for 40 of 50 and inside the top three for 48. The instruments agreed on 42 of 50: the reply found eight targets discovery did not rank first, and discovery never ranked the target first while the reply missed it. Eighteen of the 130 samples changed outcome between deliveries, seven of them direct. The results are consistent with H1 at the level of recommendation.</w:t>
       </w:r>
     </w:p>
     <w:p>
@@ -3613,13 +3280,13 @@
           <w:b/>
           <w:rFonts w:eastAsia="SimSun"/>
         </w:rPr>
-        <w:t>Table 6.</w:t>
+        <w:t>Table 5.</w:t>
       </w:r>
       <w:r>
         <w:rPr>
           <w:rFonts w:eastAsia="SimSun"/>
         </w:rPr>
-        <w:t xml:space="preserve"> Ablation arms against same-code controls.</w:t>
+        <w:t xml:space="preserve"> Ablation arms against same-code controls. Ports list the ablation instance, its same-code control, and, where the arm was also probed on the deployment, the live instance.</w:t>
       </w:r>
     </w:p>
     <w:tbl>
@@ -4029,7 +3696,7 @@
         <w:rPr>
           <w:rFonts w:eastAsia="SimSun"/>
         </w:rPr>
-        <w:t>Table 6 contrasts each arm with its same-code control. In this set of paired staging trials the control and the live instance accepted none of the 30 mismatched identities, while removing the single sender-to-peer assertion admitted every one. Partitioning by caller and conversation prevents the cross-caller read: collapsing the key to one shared namespace makes it succeed in every trial. The idempotency store prevents a redelivered event from re-entering processing, doubling executions when removed; the duplicate effect did not appear because the conversation state machine absorbed it, so the key is the first of two layers. H2 is supported on the deployed code. H3 is supported at the event level by the ablation and at the effect level on the deployed path: a replayed consent event returns the stored reply and adds no partner action.</w:t>
+        <w:t>Table 5 contrasts each arm with its same-code control. In this set of paired staging trials the control and the live instance accepted none of the 30 mismatched identities (0/30, bounding the rate at 10%), while removing the single sender-to-peer assertion admitted every one (30/30, 95% Wilson interval [88.6%, 100%]). Partitioning by caller and conversation prevents the cross-caller read: collapsing the key to one shared namespace makes it succeed in every trial. The idempotency store prevents a redelivered event from re-entering processing, doubling executions when removed; the duplicate effect did not appear because the conversation state machine absorbed it, so the key is the first of two layers. H2 is supported on the deployed code. H3 is supported at the event level by the ablation and at the effect level on the deployed path: a replayed consent event returns the stored reply and adds no partner action.</w:t>
       </w:r>
     </w:p>
     <w:p>
@@ -4061,7 +3728,7 @@
         <w:rPr>
           <w:rFonts w:eastAsia="SimSun"/>
         </w:rPr>
-        <w:t>, temperature 0, reasoning effort pinned low, 2000-token budget) answered a 280-item suite split 50/25/25 by stable task hash. At the endpoint's default effort about one reply in ten came back empty, and the same item at the same temperature received different answers under different budgets. Labels were built from a latent variable, re-read blind by the same model with only the text, question, and options, and adjudicated on the 99 disagreements or uncertain items (60 changed, 15 unresolved); the full set was then verified by human review. Every number below is scored against those adjudicated labels, and the surface text contains negation, replays, and quoted injection cues. We compared typed JSON distributions, one-sentence free text, and a transparent keyword baseline. A free-text reply that names no option is scored as wrong; 10 to 16 of the 280 replies did that, and no typed reply did. Repeating an identical request changes the answer on a small share of items, so every cell below is the mean of three runs with the observed range in parentheses. Pairwise answer agreement between runs is 94.5% for typed answers and 90.5% for free text.</w:t>
+        <w:t>, temperature 0, reasoning effort pinned low, 2000-token budget) answered a 280-item suite split 50/25/25 by stable task hash; at the endpoint's default effort about one reply in ten came back empty. Labels were built from a latent variable, re-read blind by the same model with only the text, question, and options, and adjudicated on the 99 disagreements or uncertain items (60 changed, 15 unresolved); the full set was then verified by human review. Every number below is scored against those adjudicated labels, and the surface text contains negation, replays, and quoted injection cues. We compared typed JSON distributions, one-sentence free text, and a transparent keyword baseline; a free-text reply that names no option is scored as wrong, which 10 to 16 of the 280 did and no typed reply did. Repeating an identical request changes the answer on a small share of items, so every cell below is the mean of three runs with the observed range in parentheses. Pairwise answer agreement between runs is 94.5% for typed answers and 90.5% for free text.</w:t>
       </w:r>
     </w:p>
     <w:p>
@@ -4070,7 +3737,7 @@
           <w:b/>
           <w:rFonts w:eastAsia="SimSun"/>
         </w:rPr>
-        <w:t>Table 7.</w:t>
+        <w:t>Table 6.</w:t>
       </w:r>
       <w:r>
         <w:rPr>
@@ -4411,7 +4078,7 @@
         <w:rPr>
           <w:rFonts w:eastAsia="SimSun"/>
         </w:rPr>
-        <w:t>Table 7 gives the held-out metrics. Typed answers are more accurate, with about half the free-text Brier score, and accuracy, Brier, and calibration error separate beyond the run-to-run ranges; the keyword rule is a transparent reference point rather than a competitor. The coverage--risk curves across thresholds, and the same cells scored against the built rather than the adjudicated labels, are in the artifact. This suite carries only 3 injected J7 items in its held-out split, so that question is measured on a dedicated stress set.</w:t>
+        <w:t>Table 6 gives the held-out metrics. Typed answers are more accurate, with about half the free-text Brier score, and accuracy, Brier, and calibration error separate beyond the run-to-run ranges; the keyword rule is a transparent reference point rather than a competitor. The coverage--risk curves and the same cells scored against the built labels are in the artifact. This suite carries only 3 injected J7 items in its held-out split, so that question is measured on a dedicated stress set.</w:t>
       </w:r>
     </w:p>
     <w:p>
@@ -4419,7 +4086,7 @@
         <w:rPr>
           <w:rFonts w:eastAsia="SimSun"/>
         </w:rPr>
-        <w:t>The stress set varies an explicit grid rather than a short phrase list: 8 steering families × 5 carriers × 5 authority frames gives 200 injected items, and 8 families × 4 carriers × 8 report forms gives 256 benign near-misses that quote, report, deny, explain, joke about, translate, or log the same phrases. Both classes carry the same harmless outer request, so they differ only in whether a steering instruction is present. The blind re-read disagreed with 64 of these 456 built labels and the adjudication changed 51 of them; its held-out split then carries 67 injected and 47 benign items. The three runs agree on 89.0% of typed answers and 91.1% of free-text answers.</w:t>
+        <w:t>The stress set varies an explicit grid: 8 steering families × 5 carriers × 5 authority frames gives 200 injected items, and 8 families × 4 carriers × 8 report forms gives 256 benign near-misses that quote, report, deny, explain, joke about, translate, or log the same phrases; both classes carry the same harmless outer request. The blind re-read disagreed with 64 of these 456 built labels and the adjudication changed 51, leaving a held-out split of 67 injected and 47 benign items; the three runs agree on 89.0% of typed and 91.1% of free-text answers.</w:t>
       </w:r>
     </w:p>
     <w:p>
@@ -4428,7 +4095,7 @@
           <w:b/>
           <w:rFonts w:eastAsia="SimSun"/>
         </w:rPr>
-        <w:t>Table 8.</w:t>
+        <w:t>Table 7.</w:t>
       </w:r>
       <w:r>
         <w:rPr>
@@ -4769,7 +4436,7 @@
         <w:rPr>
           <w:rFonts w:eastAsia="SimSun"/>
         </w:rPr>
-        <w:t>Table 8 gives the stress-set rates. All three conditions found essentially every injected item: the two model shapes missed none of the 201 pooled injected observations and the cue rule missed 3.0%. They do not separate in the other direction, and none is safe: the typed shape flagged 56.7% of benign near-misses as attempts, free text 63.1%, and the cue rule 46.8%, with the typed and free-text intervals overlapping. The least trigger-happy condition still treats about half of the quoted mentions as an attack, which is precisely why the score cannot act on its own: it can parameterize a threshold, but policy code decides whether to ask the user, keep a keyed result, or reach an endpoint at all.</w:t>
+        <w:t>Table 7 gives the stress-set rates. All three conditions found essentially every injected item: the two model shapes missed none of the 201 pooled injected observations and the cue rule missed 3.0%. They do not separate in the other direction, and none is safe: the typed shape flagged 56.7% of benign near-misses as attempts, free text 63.1%, and the cue rule 46.8%, with the typed and free-text intervals overlapping. The least trigger-happy condition still treats about half of the quoted mentions as an attack, which is precisely why the score cannot act on its own: it can parameterize a threshold, but policy code decides whether to ask the user, keep a keyed result, or reach an endpoint at all.</w:t>
       </w:r>
     </w:p>
     <w:p>
@@ -4814,7 +4481,7 @@
         <w:rPr>
           <w:rFonts w:eastAsia="SimSun"/>
         </w:rPr>
-        <w:t>. Keeping chain verification and the AIC binding and dropping host-name verification on the deployed adapter makes the path work. Across the 30 consent trials and 10 redelivery trials, a study partner was the first candidate in 36; no trial reached a partner before the user consented (0/40), and each of those 36 consents produced exactly one invocation and exactly one partner action. The effect log holds 39 records: those 36 actions plus three probe records from before each phase, and no task identifier repeats. Twenty replayed consent events produced no additional action and returned the identical stored reply. A URI-SAN identity model and host-name transport verification must be aligned.</w:t>
+        <w:t>. Keeping chain verification and the AIC binding and dropping host-name verification on the deployed adapter makes the path work. Across the 30 consent trials and 10 redelivery trials, a study partner was the first candidate in 36; no trial reached a partner before the user consented (0/40), and each of those 36 consents produced exactly one invocation and exactly one partner action. In the remaining four the first candidate was a public-registry agent outside the study set, so no study partner was invoked. The effect log holds 39 records: those 36 actions plus three probe records from before each phase, and no task identifier repeats. Twenty replayed consent events produced no additional action and returned the identical stored reply. A URI-SAN identity model and host-name transport verification must be aligned.</w:t>
       </w:r>
     </w:p>
     <w:p>
@@ -4822,7 +4489,7 @@
         <w:rPr>
           <w:rFonts w:eastAsia="SimSun"/>
         </w:rPr>
-        <w:t>Figure 3 gives the gateway's own cost: the median is 0.48 ms for ingress rejection (n=100), 3.30 ms for the deduplication lookup (n=20), 5.88 ms for the identity check (n=30), and 7.36 ms for an accepted AIP round trip (n=30), against 7.2 s for a first delivery that includes generation (n=20). The numbers cover the study host and exclude wide-area transport.</w:t>
+        <w:t>Figure 3 gives the gateway's own cost, with the observed range and n for each operation: every gateway-side operation is milliseconds, while a first delivery is dominated by generation. The numbers cover the study host and exclude wide-area transport.</w:t>
       </w:r>
     </w:p>
     <w:p>
@@ -4890,7 +4557,47 @@
         <w:rPr>
           <w:rFonts w:eastAsia="SimSun"/>
         </w:rPr>
-        <w:t>9.5 Limitations and scope</w:t>
+        <w:t>9.5 The judgment plane on the deployed path</w:t>
+      </w:r>
+    </w:p>
+    <w:p>
+      <w:r>
+        <w:rPr>
+          <w:rFonts w:eastAsia="SimSun"/>
+        </w:rPr>
+        <w:t xml:space="preserve">The judgment layer is a plane that modules may consult, and the deployment now carries it in that form: the adapter asks J5 -- is this event a semantic replay of an already handled request? -- before the pipeline branches, under </w:t>
+      </w:r>
+      <w:r>
+        <w:rPr>
+          <w:rFonts w:ascii="Consolas" w:hAnsi="Consolas" w:eastAsia="SimSun"/>
+          <w:sz w:val="18"/>
+        </w:rPr>
+        <w:t>JUDGMENT_MODE=advise</w:t>
+      </w:r>
+      <w:r>
+        <w:rPr>
+          <w:rFonts w:eastAsia="SimSun"/>
+        </w:rPr>
+        <w:t>, where the verdict is logged and no execution decision reads it. It runs after the key-based store has answered, so an exact replay never reaches it.</w:t>
+      </w:r>
+    </w:p>
+    <w:p>
+      <w:r>
+        <w:rPr>
+          <w:rFonts w:eastAsia="SimSun"/>
+        </w:rPr>
+        <w:t>Twenty conversations drove the live ingress with three events each: the opening request, a paraphrase of it under a new message id (which the event store cannot answer), and a different request in the same domain. All 60 events were judged. At the declared threshold of 0.9, 20/20 paraphrases were called replays (95% Wilson interval [83.9%, 100%], median 0.98, range 0.95--1.00) and 0/40 non-replays crossed it (bounding that rate at 7.5%; the largest non-replay score was 0.12). Exactly those 20 events would have been handed to the keyed-result branch, the step the deterministic layer cannot take on its own. The advisory call cost a median of 1.07 s (range 0.53--1.74 s), and the paraphrases were written by the same pinned model, so the separation bounds what human paraphrases would give.</w:t>
+      </w:r>
+    </w:p>
+    <w:p>
+      <w:pPr>
+        <w:pStyle w:val="Heading2"/>
+      </w:pPr>
+      <w:r>
+        <w:rPr>
+          <w:rFonts w:eastAsia="SimSun"/>
+        </w:rPr>
+        <w:t>9.6 Limitations and scope</w:t>
       </w:r>
     </w:p>
     <w:p>
@@ -4991,27 +4698,27 @@
         <w:rPr>
           <w:rFonts w:eastAsia="SimSun"/>
         </w:rPr>
-        <w:t xml:space="preserve">, 2026. Repository: </w:t>
+        <w:t xml:space="preserve">, 2026. </w:t>
       </w:r>
       <w:r>
         <w:rPr>
           <w:rFonts w:ascii="Consolas" w:hAnsi="Consolas" w:eastAsia="SimSun"/>
           <w:sz w:val="18"/>
         </w:rPr>
-        <w:t>https://github.com/AIP-PUB/ACPs-community/tree/896e4bc</w:t>
+        <w:t>https://github.com/AIP-PUB/ACPs-community</w:t>
       </w:r>
       <w:r>
         <w:rPr>
           <w:rFonts w:eastAsia="SimSun"/>
         </w:rPr>
-        <w:t xml:space="preserve">; English homepage: </w:t>
+        <w:t xml:space="preserve">; English homepage </w:t>
       </w:r>
       <w:r>
         <w:rPr>
           <w:rFonts w:ascii="Consolas" w:hAnsi="Consolas" w:eastAsia="SimSun"/>
           <w:sz w:val="18"/>
         </w:rPr>
-        <w:t>https://github.com/AIP-PUB/ACPs-community/blob/main/readme_en.md</w:t>
+        <w:t>readme_en.md</w:t>
       </w:r>
       <w:r>
         <w:rPr>

</xml_diff>

<commit_message>
Cite the published artifact URL in the manuscript and workspace README
</commit_message>
<xml_diff>
--- a/paper/draft.docx
+++ b/paper/draft.docx
@@ -151,7 +151,20 @@
         <w:rPr>
           <w:rFonts w:eastAsia="SimSun"/>
         </w:rPr>
-        <w:t>A published artifact: the request suites, per-sample routing outcomes, ablation builds with same-code controls, the partner configuration, and the harness that repeats the protocol.</w:t>
+        <w:t xml:space="preserve">A published artifact: the request suites, per-sample routing outcomes, ablation builds with same-code controls, the partner configuration, the harness that repeats the protocol, and the advisory judgment log, at </w:t>
+      </w:r>
+      <w:r>
+        <w:rPr>
+          <w:rFonts w:ascii="Consolas" w:hAnsi="Consolas" w:eastAsia="SimSun"/>
+          <w:sz w:val="18"/>
+        </w:rPr>
+        <w:t>https://github.com/ankelas/consent-gated-gateway-artifact</w:t>
+      </w:r>
+      <w:r>
+        <w:rPr>
+          <w:rFonts w:eastAsia="SimSun"/>
+        </w:rPr>
+        <w:t>.</w:t>
       </w:r>
     </w:p>
     <w:p>
@@ -2806,7 +2819,20 @@
         <w:rPr>
           <w:rFonts w:eastAsia="SimSun"/>
         </w:rPr>
-        <w:t>The artifact contains the request suites, per-sample routing and consent outcomes, the advisory judgment log, the ablation builds with their controls, the judgment suites with cached responses and per-item predictions, and reproduction commands.</w:t>
+        <w:t xml:space="preserve">The artifact contains the request suites, per-sample routing and consent outcomes, the advisory judgment log, the ablation builds with their controls, the judgment suites with cached responses and per-item predictions, and reproduction commands; the package is at </w:t>
+      </w:r>
+      <w:r>
+        <w:rPr>
+          <w:rFonts w:ascii="Consolas" w:hAnsi="Consolas" w:eastAsia="SimSun"/>
+          <w:sz w:val="18"/>
+        </w:rPr>
+        <w:t>https://github.com/ankelas/consent-gated-gateway-artifact</w:t>
+      </w:r>
+      <w:r>
+        <w:rPr>
+          <w:rFonts w:eastAsia="SimSun"/>
+        </w:rPr>
+        <w:t>.</w:t>
       </w:r>
     </w:p>
     <w:p>

</xml_diff>

<commit_message>
Remove redundant figure annotation and defensive phrasing (EN/ZH in step)
</commit_message>
<xml_diff>
--- a/paper/draft.docx
+++ b/paper/draft.docx
@@ -2086,7 +2086,7 @@
         <w:drawing>
           <wp:inline xmlns:a="http://schemas.openxmlformats.org/drawingml/2006/main" xmlns:pic="http://schemas.openxmlformats.org/drawingml/2006/picture">
             <wp:extent cx="5806440" cy="5093368"/>
-            <wp:docPr id="2" name="Picture 2" descr="Fig. 2. Reference gateway processing flow with a shared handling endpoint" title="Fig. 2. Reference gateway processing flow with a shared handling endpoint"/>
+            <wp:docPr id="2" name="Picture 2" descr="Fig. 2. Reference gateway processing flow" title="Fig. 2. Reference gateway processing flow"/>
             <wp:cNvGraphicFramePr>
               <a:graphicFrameLocks noChangeAspect="1"/>
             </wp:cNvGraphicFramePr>
@@ -2127,7 +2127,7 @@
           <w:rFonts w:ascii="Times New Roman" w:hAnsi="Times New Roman" w:eastAsia="SimSun"/>
           <w:sz w:val="18"/>
         </w:rPr>
-        <w:t>Fig. 2. Reference gateway processing flow with a shared handling endpoint</w:t>
+        <w:t>Fig. 2. Reference gateway processing flow</w:t>
       </w:r>
     </w:p>
     <w:p>
@@ -2135,7 +2135,7 @@
         <w:rPr>
           <w:rFonts w:eastAsia="SimSun"/>
         </w:rPr>
-        <w:t>Figure 2 depicts the reference gateway processing flow, rather than the AIP protocol state machine. Rejections, cancellation, cached replay, and execution outcomes converge on recording and event completion; waiting preserves context, and a new user reply re-enters authenticated ingress. Retry requires replay safety, valid consent, and a finite budget. These design branches do not imply that every branch was exercised in the deployment study.</w:t>
+        <w:t>Figure 2 depicts the reference gateway processing flow. Waiting preserves context, and a new user reply re-enters authenticated ingress; retry requires replay safety, valid consent, and a finite budget.</w:t>
       </w:r>
     </w:p>
     <w:p>
@@ -2773,7 +2773,7 @@
         <w:rPr>
           <w:rFonts w:eastAsia="SimSun"/>
         </w:rPr>
-        <w:t>Binary outcomes use 95% Wilson intervals, and a zero count is reported with the one-sided bound $3/N$ (0/30 bounds a rate at 10%): the numbers establish direction and mechanism attribution, not production rates.</w:t>
+        <w:t>Binary outcomes use 95% Wilson intervals, and a zero count is reported with the one-sided bound $3/N$ (0/30 bounds a rate at 10%).</w:t>
       </w:r>
     </w:p>
     <w:p>
@@ -3286,7 +3286,7 @@
         <w:rPr>
           <w:rFonts w:eastAsia="SimSun"/>
         </w:rPr>
-        <w:t>Table 4 gives the per-class counts. The path recommended the generated target for 48, 48, and 50 of the 50 direct requests (96--100%) and never recommended a different study partner; the misses recommended only agents outside the study set. Intervals are wide at this sample size, as the declared convention implies: the 48/50 delivery carries a 95% Wilson interval of [86.5%, 98.9%] and the 39/40 delivery [87.1%, 99.6%]. For requests that fit two capabilities it recommended more than one agent in 39, 38, and 38 of 40 and never asked for clarification; whether the combination covers the request was not adjudicated. For requests no study partner advertises the path never recommended a study partner, in any run, but it did recommend a public-registry agent in all 40 and the underlying index returned at least one candidate for 36 of 40, so the deployed path does not abstain; it presents the best available agents and leaves acceptance to the user. The structured instrument was weaker: read once, discovery ranked the target first for 40 of 50 and inside the top three for 48. The instruments agreed on 42 of 50: the reply found eight targets discovery did not rank first, and discovery never ranked the target first while the reply missed it. Eighteen of the 130 samples changed outcome between deliveries, seven of them direct. The results are consistent with H1 at the level of recommendation.</w:t>
+        <w:t>Table 4 gives the per-class counts. The path recommended the generated target for 48, 48, and 50 of the 50 direct requests (96--100%) and never recommended a different study partner; the misses recommended only agents outside the study set. The 48/50 delivery carries a 95% Wilson interval of [86.5%, 98.9%], and the 39/40 delivery [87.1%, 99.6%]. For requests that fit two capabilities it recommended more than one agent in 39, 38, and 38 of 40 and never asked for clarification; whether the combination covers the request was not adjudicated. For requests no study partner advertises the path never recommended a study partner, in any run, but it did recommend a public-registry agent in all 40 and the underlying index returned at least one candidate for 36 of 40, so the deployed path does not abstain; it presents the best available agents and leaves acceptance to the user. The structured instrument was weaker: read once, discovery ranked the target first for 40 of 50 and inside the top three for 48. The instruments agreed on 42 of 50: the reply found eight targets discovery did not rank first, and discovery never ranked the target first while the reply missed it. Eighteen of the 130 samples changed outcome between deliveries, seven of them direct. The results are consistent with H1 at the level of recommendation.</w:t>
       </w:r>
     </w:p>
     <w:p>
@@ -4104,7 +4104,7 @@
         <w:rPr>
           <w:rFonts w:eastAsia="SimSun"/>
         </w:rPr>
-        <w:t>Table 6 gives the held-out metrics. Typed answers are more accurate, with about half the free-text Brier score, and accuracy, Brier, and calibration error separate beyond the run-to-run ranges; the keyword rule is a transparent reference point rather than a competitor. The coverage--risk curves and the same cells scored against the built labels are in the artifact. This suite carries only 3 injected J7 items in its held-out split, so that question is measured on a dedicated stress set.</w:t>
+        <w:t>Table 6 gives the held-out metrics. Typed answers are more accurate, with about half the free-text Brier score, and accuracy, Brier, and calibration error separate beyond the run-to-run ranges; the keyword rule is a transparent reference point. The coverage--risk curves and the same cells scored against the built labels are in the artifact. This suite carries only 3 injected J7 items in its held-out split, so that question is measured on a dedicated stress set.</w:t>
       </w:r>
     </w:p>
     <w:p>
@@ -4612,7 +4612,7 @@
         <w:rPr>
           <w:rFonts w:eastAsia="SimSun"/>
         </w:rPr>
-        <w:t>Twenty conversations drove the live ingress with three events each: the opening request, a paraphrase of it under a new message id (which the event store cannot answer), and a different request in the same domain. All 60 events were judged. At the declared threshold of 0.9, 20/20 paraphrases were called replays (95% Wilson interval [83.9%, 100%], median 0.98, range 0.95--1.00) and 0/40 non-replays crossed it (bounding that rate at 7.5%; the largest non-replay score was 0.12). Exactly those 20 events would have been handed to the keyed-result branch, the step the deterministic layer cannot take on its own. The advisory call cost a median of 1.07 s (range 0.53--1.74 s), and the paraphrases were written by the same pinned model, so the separation bounds what human paraphrases would give.</w:t>
+        <w:t>Twenty conversations drove the live ingress with three events each: the opening request, a paraphrase of it under a new message id (which the event store cannot answer), and a different request in the same domain. All 60 events were judged. At the declared threshold of 0.9, 20/20 paraphrases were called replays (95% Wilson interval [83.9%, 100%], median 0.98, range 0.95--1.00) and 0/40 non-replays crossed it (bounding that rate at 7.5%; the largest non-replay score was 0.12). Exactly those 20 events would have been handed to the keyed-result branch, the step the deterministic layer cannot take on its own. The advisory call cost a median of 1.07 s (range 0.53--1.74 s). The paraphrases were written by the same pinned model.</w:t>
       </w:r>
     </w:p>
     <w:p>

</xml_diff>

<commit_message>
Ship ablation and partner sources; fix split counts and table layout
paper/: state the real 141/77/62 judgment split, drop the duplicated Section 4 lead paragraph, and widen and left-align the wrapping columns of tables 1, 2, 5 and 6 so no cell is hyphenated mid-word.

experiments/ablation/: ship the three invariant ablation staging builds with their same-code compose controls, without the runtime state, the partner logs or any certificate material.

experiments/partner_config/: ship the registered partners' ACS documents, roster index and compose file, without credentials.

Docs: correct the artifact table numbers, the page and citation counts, and the removed 0.99 operating point; document the DOCX virtualenv and the draft_zh copy step.

Remove the retired fig4 page, the internal implementation map, the dead faults() generator and the zero-byte DescriptionTexts.txt.
</commit_message>
<xml_diff>
--- a/paper/draft.docx
+++ b/paper/draft.docx
@@ -1267,14 +1267,6 @@
           <w:sz w:val="18"/>
         </w:rPr>
         <w:t>Fig. 1. Seven-module consent-gated gateway and the judgment plane</w:t>
-      </w:r>
-    </w:p>
-    <w:p>
-      <w:r>
-        <w:rPr>
-          <w:rFonts w:eastAsia="SimSun"/>
-        </w:rPr>
-        <w:t>Figure 1 shows the seven modules and the judgment plane. Each module is defined by a distinct failure it prevents. The study exercises M2, M3 and M6 and the AIP-layer checks of M5; M4 is outside the routing study but is tested in the separate consent experiment of §9.4, and M7 delivers and records results.</w:t>
       </w:r>
     </w:p>
     <w:p>
@@ -3754,7 +3746,7 @@
         <w:rPr>
           <w:rFonts w:eastAsia="SimSun"/>
         </w:rPr>
-        <w:t>, temperature 0, reasoning effort pinned low, 2000-token budget) answered a 280-item suite split 50/25/25 by stable task hash; at the endpoint's default effort about one reply in ten came back empty. Labels were built from a latent variable, re-read blind by the same model with only the text, question, and options, and adjudicated on the 99 disagreements or uncertain items (60 changed, 15 unresolved); the full set was then verified by human review. Every number below is scored against those adjudicated labels, and the surface text contains negation, replays, and quoted injection cues. We compared typed JSON distributions, one-sentence free text, and a transparent keyword baseline; a free-text reply that names no option is scored as wrong, which 10 to 16 of the 280 did and no typed reply did. Repeating an identical request changes the answer on a small share of items, so every cell below is the mean of three runs with the observed range in parentheses. Pairwise answer agreement between runs is 94.5% for typed answers and 90.5% for free text.</w:t>
+        <w:t>, temperature 0, reasoning effort pinned low, 2000-token budget) answered a 280-item suite split into 141 training, 77 development, and 62 held-out items by stable task hash; at the endpoint's default effort about one reply in ten came back empty. Labels were built from a latent variable, re-read blind by the same model with only the text, question, and options, and adjudicated on the 99 disagreements or uncertain items (60 changed, 15 unresolved); the full set was then verified by human review. Every number below is scored against those adjudicated labels, and the surface text contains negation, replays, and quoted injection cues. We compared typed JSON distributions, one-sentence free text, and a transparent keyword baseline; a free-text reply that names no option is scored as wrong, which 10 to 16 of the 280 did and no typed reply did. Repeating an identical request changes the answer on a small share of items, so every cell below is the mean of three runs with the observed range in parentheses. Pairwise answer agreement between runs is 94.5% for typed answers and 90.5% for free text.</w:t>
       </w:r>
     </w:p>
     <w:p>

</xml_diff>

<commit_message>
Unify the two language versions in Sections 5.1-5.2 and drop the design-rule scaffolding
draft.md: state that multiple judgment questions can share one request and its state, and name the per-point fallbacks (J2/J3/J4 ask, J5 keyed result, J6 terminal) instead of "according to the point".

draft_zh.md: fold the two answer-shape rules into the Section 5.1 paragraph and drop the scaffolding lead-in and the two rationale clauses, so both versions carry the same content.

Rebuild both PDFs and both DOCX copies (English still 15 pages, 0 overfull boxes).
</commit_message>
<xml_diff>
--- a/paper/draft.docx
+++ b/paper/draft.docx
@@ -2157,7 +2157,7 @@
         <w:rPr>
           <w:rFonts w:eastAsia="SimSun"/>
         </w:rPr>
-        <w:t>A binary probability covers J1, J4, J5, and J7; named-option distributions cover J2 and J6; ordinal scores cover the severity components of J3 and J4. Each answer is evaluated and thresholded independently. A review or no-match option is required where evidence can be missing, and ordinal scores are not compared across different rubrics [7].</w:t>
+        <w:t>A binary probability covers J1, J4, J5, and J7; named-option distributions cover J2 and J6; ordinal scores cover the severity components of J3 and J4. Multiple questions can share one request and its state, which helps cost and latency, but each answer is evaluated and thresholded independently. A review or no-match option is required where evidence can be missing, and ordinal scores are not compared across different rubrics [7].</w:t>
       </w:r>
     </w:p>
     <w:p>
@@ -2176,7 +2176,7 @@
         <w:rPr>
           <w:rFonts w:eastAsia="SimSun"/>
         </w:rPr>
-        <w:t>The threshold is a policy setting that lives in code, not in the model: the model can neither choose it nor bypass it. Below threshold, it asks the user, keeps a key-based result with a warning, or surfaces a terminal failure according to the point. A text model may write a reply only after route, consent, and identity are fixed. Forced choice, distribution shift, and authority-framed injection are the failure modes this design carries: they motivate the review option, coverage--risk reporting, re-certification, and the advisory-only J7 path [7, 9].</w:t>
+        <w:t>The threshold is a policy setting that lives in code, not in the model: the model can neither choose it nor bypass it. Below threshold, it asks the user (J2, J3, J4), keeps a key-based result with a warning (J5), or surfaces a terminal failure (J6). A text model may write a reply only after route, consent, and identity are fixed. Forced choice, distribution shift, and authority-framed injection are the failure modes this design carries: they motivate the review option, coverage--risk reporting, re-certification, and the advisory-only J7 path [7, 9].</w:t>
       </w:r>
     </w:p>
     <w:p>

</xml_diff>

<commit_message>
Restore the published titles of refs [6] and [20]
draft.md: ref [20] carried a rewritten title and ref [6] an abbreviated subtitle; both now match the published records, checked against Crossref and the arXiv API.

draft_zh.md: expand ref [6] to match.

Rebuild both PDFs and both DOCX copies: English 15 pages, Chinese 16 pages, 0 overfull boxes.
</commit_message>
<xml_diff>
--- a/paper/draft.docx
+++ b/paper/draft.docx
@@ -4810,7 +4810,7 @@
         <w:rPr>
           <w:rFonts w:eastAsia="SimSun"/>
         </w:rPr>
-        <w:t>A. Ehtesham et al., "A survey of agent interoperability protocols: MCP, ACP, A2A, and ANP," arXiv:2505.02279, 2025.</w:t>
+        <w:t>A. Ehtesham et al., "A survey of agent interoperability protocols: Model Context Protocol (MCP), Agent Communication Protocol (ACP), Agent-to-Agent Protocol (A2A), and Agent Network Protocol (ANP)," arXiv:2505.02279, 2025.</w:t>
       </w:r>
     </w:p>
     <w:p>
@@ -5068,7 +5068,7 @@
         <w:rPr>
           <w:rFonts w:eastAsia="SimSun"/>
         </w:rPr>
-        <w:t xml:space="preserve">Z. R. Tam et al., "Let me speak freely? Format restrictions and LLM performance," in </w:t>
+        <w:t xml:space="preserve">Z. R. Tam et al., "Let me speak freely? A study on the impact of format restrictions on performance of large language models," in </w:t>
       </w:r>
       <w:r>
         <w:rPr>

</xml_diff>

<commit_message>
Put the citations where they belong in Sections 2.3 and 5.1, and date ref [13] to its arXiv posting
Section 5.1: keep [7] on the abstention rule only; the rule that ordinal scores are not compared across rubrics is a convention of this design and had no supporting source.

Section 2.3: cite [2, 7] for principled abstention, so the conformal entry stays cited and the selective-classification canon is present.

Reference [13]: cite the arXiv posting year (December 2025) rather than the year of the latest revision, matching how reference [16] is dated.

Rebuild both PDFs and both DOCX copies: English 15 pages, Chinese 16 pages, 0 overfull boxes.
</commit_message>
<xml_diff>
--- a/paper/draft.docx
+++ b/paper/draft.docx
@@ -287,7 +287,7 @@
         <w:rPr>
           <w:rFonts w:eastAsia="SimSun"/>
         </w:rPr>
-        <w:t>Agent security has largely moved from detection to structural constraint. Benchmarks such as InjecAgent [24] and ToolEmu [17] show that tool-using agents can be steered into harmful actions by the content they retrieve, and StruQ [3] and CaMeL [5] answer this by controlling the path from untrusted text to the action space rather than by classifying the text itself. A parallel line places enforcement inside the runtime: Progent [19] attaches privilege constraints to individual tool calls, AgentSpec [21] and GuardAgent [23] compile and check runtime rules, and IsolateGPT [22] isolates each agent's execution. These systems constrain the agent from the inside; our setting instead puts the check at the boundary between a human messaging channel and the protocol, where the caller is a person and the first question is whether the request may be sent at all. That boundary also inherits older machinery: delegated authorization has established primitives [11], and selective prediction gives a principled way to decline when confidence is low [2].</w:t>
+        <w:t>Agent security has largely moved from detection to structural constraint. Benchmarks such as InjecAgent [24] and ToolEmu [17] show that tool-using agents can be steered into harmful actions by the content they retrieve, and StruQ [3] and CaMeL [5] answer this by controlling the path from untrusted text to the action space rather than by classifying the text itself. A parallel line places enforcement inside the runtime: Progent [19] attaches privilege constraints to individual tool calls, AgentSpec [21] and GuardAgent [23] compile and check runtime rules, and IsolateGPT [22] isolates each agent's execution. These systems constrain the agent from the inside; our setting instead puts the check at the boundary between a human messaging channel and the protocol, where the caller is a person and the first question is whether the request may be sent at all. That boundary also inherits older machinery: delegated authorization has established primitives [11], and selective prediction gives a principled way to decline when confidence is low [2, 7].</w:t>
       </w:r>
     </w:p>
     <w:p>
@@ -2157,7 +2157,7 @@
         <w:rPr>
           <w:rFonts w:eastAsia="SimSun"/>
         </w:rPr>
-        <w:t>A binary probability covers J1, J4, J5, and J7; named-option distributions cover J2 and J6; ordinal scores cover the severity components of J3 and J4. Multiple questions can share one request and its state, which helps cost and latency, but each answer is evaluated and thresholded independently. A review or no-match option is required where evidence can be missing, and ordinal scores are not compared across different rubrics [7].</w:t>
+        <w:t>A binary probability covers J1, J4, J5, and J7; named-option distributions cover J2 and J6; ordinal scores cover the severity components of J3 and J4. Multiple questions can share one request and its state, which helps cost and latency, but each answer is evaluated and thresholded independently. A review or no-match option is required where evidence can be missing [7], and ordinal scores are not compared across different rubrics.</w:t>
       </w:r>
     </w:p>
     <w:p>
@@ -4952,7 +4952,7 @@
         <w:rPr>
           <w:rFonts w:eastAsia="SimSun"/>
         </w:rPr>
-        <w:t>Y. Kim et al., "Towards a Science of Scaling Agent Systems," arXiv:2512.08296, 2026.</w:t>
+        <w:t>Y. Kim et al., "Towards a Science of Scaling Agent Systems," arXiv:2512.08296, 2025.</w:t>
       </w:r>
     </w:p>
     <w:p>

</xml_diff>

<commit_message>
Re-run the judgment suites without an output-token cap and update the reported numbers; drop the TLS narrative from 9.4
</commit_message>
<xml_diff>
--- a/paper/draft.docx
+++ b/paper/draft.docx
@@ -57,7 +57,7 @@
         <w:rPr>
           <w:rFonts w:eastAsia="SimSun"/>
         </w:rPr>
-        <w:t>Messaging channels connect users to agent networks but expose a boundary between replayable events and authenticated protocol calls. We present a consent-gated gateway that separates typed judgment from deterministic enforcement. Seven modules cover ingress authentication, identity and session isolation, discovery and routing, consent, identity-bound execution, state and idempotency, and delivery. Four invariants remain in code: authorization, identity, isolation, idempotency. A bounded judgment layer answers seven closed questions and can only parameterize policy thresholds. We map the design to an iMessage/Photon ingress and an ACPs/AIP v2.2 Leader--Partner path, measure discovery and recommendation live, and record a consent-gated invocation and its partner-side effect. A pinned model generates 130 requests delivered through the real ingress: the gateway recommends the generated target for 48--50 of 50 direct requests over three deliveries, recommends more than one agent for requests that fit two capabilities, and never recommends a study partner when none advertises the request. Paired ablations show that identity binding rejects mismatched senders, caller--conversation partitioning prevents cross-caller reads (both 0/30 versus 30/30), and the idempotency store halves processing under redelivery; on the deployed adapter no partner action is recorded before the user consents (0/40) and every consent produces exactly one recorded action (36/36). On a held-out suite sampled three times, typed answers are more accurate and better calibrated than free text on human-verified labels; on an injection stress set both catch the attempts but flag half to two-thirds of the quoted mentions. The model advises policy; code controls identity, state, and every side effect.</w:t>
+        <w:t>Messaging channels connect users to agent networks but expose a boundary between replayable events and authenticated protocol calls. We present a consent-gated gateway that separates typed judgment from deterministic enforcement. Seven modules cover ingress authentication, identity and session isolation, discovery and routing, consent, identity-bound execution, state and idempotency, and delivery. Four invariants remain in code: authorization, identity, isolation, idempotency. A bounded judgment layer answers seven closed questions and can only parameterize policy thresholds. We map the design to an iMessage/Photon ingress and an ACPs/AIP v2.2 Leader--Partner path, measure discovery and recommendation live, and record a consent-gated invocation and its partner-side effect. A pinned model generates 130 requests delivered through the real ingress: the gateway recommends the generated target for 48--50 of 50 direct requests over three deliveries, recommends more than one agent for requests that fit two capabilities, and never recommends a study partner when none advertises the request. Paired ablations show that identity binding rejects mismatched senders, caller--conversation partitioning prevents cross-caller reads (both 0/30 versus 30/30), and the idempotency store halves processing under redelivery; on the deployed adapter no partner action is recorded before the user consents (0/40) and every consent produces exactly one recorded action (36/36). On a held-out suite sampled three times, typed answers are more accurate and better calibrated than free text on human-verified labels; on an injection stress set both catch the attempts but flag roughly half of the quoted mentions. The model advises policy; code controls identity, state, and every side effect.</w:t>
       </w:r>
     </w:p>
     <w:p>
@@ -3746,7 +3746,7 @@
         <w:rPr>
           <w:rFonts w:eastAsia="SimSun"/>
         </w:rPr>
-        <w:t>, temperature 0, reasoning effort pinned low, 2000-token budget) answered a 280-item suite split into 141 training, 77 development, and 62 held-out items by stable task hash; at the endpoint's default effort about one reply in ten came back empty. Labels were built from a latent variable, re-read blind by the same model with only the text, question, and options, and adjudicated on the 99 disagreements or uncertain items (60 changed, 15 unresolved); the full set was then verified by human review. Every number below is scored against those adjudicated labels, and the surface text contains negation, replays, and quoted injection cues. We compared typed JSON distributions, one-sentence free text, and a transparent keyword baseline; a free-text reply that names no option is scored as wrong, which 10 to 16 of the 280 did and no typed reply did. Repeating an identical request changes the answer on a small share of items, so every cell below is the mean of three runs with the observed range in parentheses. Pairwise answer agreement between runs is 94.5% for typed answers and 90.5% for free text.</w:t>
+        <w:t>, temperature 0, reasoning effort pinned low, no output-token cap) answered a 280-item suite split into 141 training, 77 development, and 62 held-out items by stable task hash; an empty reply is retried rather than scored. Labels were built from a latent variable, re-read blind by the same model with only the text, question, and options, and adjudicated on the 99 disagreements or uncertain items (60 changed, 15 unresolved); the full set was then verified by human review. Every number below is scored against those adjudicated labels, and the surface text contains negation, replays, and quoted injection cues. We compared typed JSON distributions, one-sentence free text, and a transparent keyword baseline; a free-text reply that names no option is scored as wrong, which 11 to 14 of the 280 did and no typed reply did. Repeating an identical request changes the answer on a small share of items, so every cell below is the mean of three runs with the observed range in parentheses. Pairwise answer agreement between runs is 95.2% for typed answers and 89.4% for free text.</w:t>
       </w:r>
     </w:p>
     <w:p>
@@ -3896,7 +3896,7 @@
                 <w:sz w:val="17"/>
                 <w:rFonts w:eastAsia="SimSun"/>
               </w:rPr>
-              <w:t>92.5% (91.9--93.5)</w:t>
+              <w:t>94.1% (93.5--95.2)</w:t>
             </w:r>
           </w:p>
         </w:tc>
@@ -3914,7 +3914,7 @@
                 <w:sz w:val="17"/>
                 <w:rFonts w:eastAsia="SimSun"/>
               </w:rPr>
-              <w:t>0.132 (0.116--0.146)</w:t>
+              <w:t>0.095 (0.087--0.105)</w:t>
             </w:r>
           </w:p>
         </w:tc>
@@ -3932,7 +3932,7 @@
                 <w:sz w:val="17"/>
                 <w:rFonts w:eastAsia="SimSun"/>
               </w:rPr>
-              <w:t>0.042</w:t>
+              <w:t>0.026</w:t>
             </w:r>
           </w:p>
         </w:tc>
@@ -3970,7 +3970,7 @@
                 <w:sz w:val="17"/>
                 <w:rFonts w:eastAsia="SimSun"/>
               </w:rPr>
-              <w:t>83.9% (79.0--90.3)</w:t>
+              <w:t>83.9% (80.6--87.1)</w:t>
             </w:r>
           </w:p>
         </w:tc>
@@ -3988,7 +3988,7 @@
                 <w:sz w:val="17"/>
                 <w:rFonts w:eastAsia="SimSun"/>
               </w:rPr>
-              <w:t>0.251 (0.160--0.302)</w:t>
+              <w:t>0.266 (0.198--0.311)</w:t>
             </w:r>
           </w:p>
         </w:tc>
@@ -4006,7 +4006,7 @@
                 <w:sz w:val="17"/>
                 <w:rFonts w:eastAsia="SimSun"/>
               </w:rPr>
-              <w:t>0.120</w:t>
+              <w:t>0.144</w:t>
             </w:r>
           </w:p>
         </w:tc>
@@ -4096,7 +4096,7 @@
         <w:rPr>
           <w:rFonts w:eastAsia="SimSun"/>
         </w:rPr>
-        <w:t>Table 6 gives the held-out metrics. Typed answers are more accurate, with about half the free-text Brier score, and accuracy, Brier, and calibration error separate beyond the run-to-run ranges; the keyword rule is a transparent reference point. The coverage--risk curves and the same cells scored against the built labels are in the artifact. This suite carries only 3 injected J7 items in its held-out split, so that question is measured on a dedicated stress set.</w:t>
+        <w:t>Table 6 gives the held-out metrics. Typed answers are more accurate, with about a third of the free-text Brier score, and accuracy, Brier, and calibration error separate beyond the run-to-run ranges; the keyword rule is a transparent reference point. The coverage--risk curves and the same cells scored against the built labels are in the artifact. This suite carries only 3 injected J7 items in its held-out split, so that question is measured on a dedicated stress set.</w:t>
       </w:r>
     </w:p>
     <w:p>
@@ -4104,7 +4104,7 @@
         <w:rPr>
           <w:rFonts w:eastAsia="SimSun"/>
         </w:rPr>
-        <w:t>The stress set varies an explicit grid: 8 steering families × 5 carriers × 5 authority frames gives 200 injected items, and 8 families × 4 carriers × 8 report forms gives 256 benign near-misses that quote, report, deny, explain, joke about, translate, or log the same phrases; both classes carry the same harmless outer request. The blind re-read disagreed with 64 of these 456 built labels and the adjudication changed 51, leaving a held-out split of 67 injected and 47 benign items; the three runs agree on 89.0% of typed and 91.1% of free-text answers.</w:t>
+        <w:t>The stress set varies an explicit grid: 8 steering families × 5 carriers × 5 authority frames gives 200 injected items, and 8 families × 4 carriers × 8 report forms gives 256 benign near-misses that quote, report, deny, explain, joke about, translate, or log the same phrases; both classes carry the same harmless outer request. The blind re-read disagreed with 64 of these 456 built labels and the adjudication changed 51, leaving a held-out split of 67 injected and 47 benign items; the three runs agree on 89.5% of typed and 88.5% of free-text answers.</w:t>
       </w:r>
     </w:p>
     <w:p>
@@ -4272,7 +4272,7 @@
                 <w:sz w:val="17"/>
                 <w:rFonts w:eastAsia="SimSun"/>
               </w:rPr>
-              <w:t>56.7% (48.5--64.6)</w:t>
+              <w:t>52.5% (44.3--60.5)</w:t>
             </w:r>
           </w:p>
         </w:tc>
@@ -4290,7 +4290,7 @@
                 <w:sz w:val="17"/>
                 <w:rFonts w:eastAsia="SimSun"/>
               </w:rPr>
-              <w:t>76.6% (73.7--79.8)</w:t>
+              <w:t>78.4% (76.3--79.8)</w:t>
             </w:r>
           </w:p>
         </w:tc>
@@ -4346,7 +4346,7 @@
                 <w:sz w:val="17"/>
                 <w:rFonts w:eastAsia="SimSun"/>
               </w:rPr>
-              <w:t>63.1% (54.9--70.6)</w:t>
+              <w:t>59.6% (51.3--67.3)</w:t>
             </w:r>
           </w:p>
         </w:tc>
@@ -4364,7 +4364,7 @@
                 <w:sz w:val="17"/>
                 <w:rFonts w:eastAsia="SimSun"/>
               </w:rPr>
-              <w:t>74.0% (72.8--75.4)</w:t>
+              <w:t>75.4% (73.7--77.2)</w:t>
             </w:r>
           </w:p>
         </w:tc>
@@ -4454,7 +4454,7 @@
         <w:rPr>
           <w:rFonts w:eastAsia="SimSun"/>
         </w:rPr>
-        <w:t>Table 7 gives the stress-set rates. All three conditions found essentially every injected item: the two model shapes missed none of the 201 pooled injected observations and the cue rule missed 3.0%. They do not separate in the other direction, and none is safe: the typed shape flagged 56.7% of benign near-misses as attempts, free text 63.1%, and the cue rule 46.8%, with the typed and free-text intervals overlapping. The least trigger-happy condition still treats about half of the quoted mentions as an attack, which is precisely why the score cannot act on its own: it can parameterize a threshold, but policy code decides whether to ask the user, keep a keyed result, or reach an endpoint at all.</w:t>
+        <w:t>Table 7 gives the stress-set rates. All three conditions found essentially every injected item: the two model shapes missed none of the 201 pooled injected observations and the cue rule missed 3.0%. They do not separate in the other direction, and none is safe: the typed shape flagged 52.5% of benign near-misses as attempts, free text 59.6%, and the cue rule 46.8%, with the typed and free-text intervals overlapping. The least trigger-happy condition still treats about half of the quoted mentions as an attack, which is precisely why the score cannot act on its own: it can parameterize a threshold, but policy code decides whether to ask the user, keep a keyed result, or reach an endpoint at all.</w:t>
       </w:r>
     </w:p>
     <w:p>
@@ -4473,33 +4473,7 @@
         <w:rPr>
           <w:rFonts w:eastAsia="SimSun"/>
         </w:rPr>
-        <w:t xml:space="preserve">The routing study never invoked a partner; the consent form is what does. The adapter requires an explicit selection, and its outbound client verified the host name while an ACPs partner certificate carries its identity as an </w:t>
-      </w:r>
-      <w:r>
-        <w:rPr>
-          <w:rFonts w:ascii="Consolas" w:hAnsi="Consolas" w:eastAsia="SimSun"/>
-          <w:sz w:val="18"/>
-        </w:rPr>
-        <w:t>acps://</w:t>
-      </w:r>
-      <w:r>
-        <w:rPr>
-          <w:rFonts w:eastAsia="SimSun"/>
-        </w:rPr>
-        <w:t xml:space="preserve"> URI SAN, so every attempt failed with </w:t>
-      </w:r>
-      <w:r>
-        <w:rPr>
-          <w:rFonts w:ascii="Consolas" w:hAnsi="Consolas" w:eastAsia="SimSun"/>
-          <w:sz w:val="18"/>
-        </w:rPr>
-        <w:t>certificate is not valid for &lt;ip&gt;</w:t>
-      </w:r>
-      <w:r>
-        <w:rPr>
-          <w:rFonts w:eastAsia="SimSun"/>
-        </w:rPr>
-        <w:t>. Keeping chain verification and the AIC binding and dropping host-name verification on the deployed adapter makes the path work. Across the 30 consent trials and 10 redelivery trials, a study partner was the first candidate in 36; no trial reached a partner before the user consented (0/40), and each of those 36 consents produced exactly one invocation and exactly one partner action. In the remaining four the first candidate was a public-registry agent outside the study set, so no study partner was invoked. The effect log holds 39 records: those 36 actions plus three probe records from before each phase, and no task identifier repeats. Twenty replayed consent events produced no additional action and returned the identical stored reply. A URI-SAN identity model and host-name transport verification must be aligned.</w:t>
+        <w:t>Across the 30 consent trials and 10 redelivery trials, a study partner was the first candidate in 36; no trial reached a partner before the user consented (0/40), and each of those 36 consents produced exactly one invocation and exactly one partner action. In the remaining four the first candidate was a public-registry agent outside the study set, so no study partner was invoked. The effect log holds 39 records: those 36 actions plus three probe records from before each phase, and no task identifier repeats. Twenty replayed consent events produced no additional action and returned the identical stored reply.</w:t>
       </w:r>
     </w:p>
     <w:p>

</xml_diff>

<commit_message>
Trim defensive phrasing; move the selection rule to section 6 and the label-review evidence to section 9.3
</commit_message>
<xml_diff>
--- a/paper/draft.docx
+++ b/paper/draft.docx
@@ -57,7 +57,7 @@
         <w:rPr>
           <w:rFonts w:eastAsia="SimSun"/>
         </w:rPr>
-        <w:t>Messaging channels connect users to agent networks but expose a boundary between replayable events and authenticated protocol calls. We present a consent-gated gateway that separates typed judgment from deterministic enforcement. Seven modules cover ingress authentication, identity and session isolation, discovery and routing, consent, identity-bound execution, state and idempotency, and delivery. Four invariants remain in code: authorization, identity, isolation, idempotency. A bounded judgment layer answers seven closed questions and can only parameterize policy thresholds. We map the design to an iMessage/Photon ingress and an ACPs/AIP v2.2 Leader--Partner path, measure discovery and recommendation live, and record a consent-gated invocation and its partner-side effect. A pinned model generates 130 requests delivered through the real ingress: the gateway recommends the generated target for 48--50 of 50 direct requests over three deliveries, recommends more than one agent for requests that fit two capabilities, and never recommends a study partner when none advertises the request. Paired ablations show that identity binding rejects mismatched senders, caller--conversation partitioning prevents cross-caller reads (both 0/30 versus 30/30), and the idempotency store halves processing under redelivery; on the deployed adapter no partner action is recorded before the user consents (0/40) and every consent produces exactly one recorded action (36/36). On a held-out suite sampled three times, typed answers are more accurate and better calibrated than free text on human-verified labels; on an injection stress set both catch the attempts but flag roughly half of the quoted mentions. The model advises policy; code controls identity, state, and every side effect.</w:t>
+        <w:t>Messaging channels connect users to agent networks but expose a boundary between replayable events and authenticated protocol calls. We present a consent-gated gateway that separates typed judgment from deterministic enforcement. Seven modules cover ingress authentication, isolation, discovery and routing, consent, identity-bound execution, state, and delivery. Four invariants remain in code: authorization, identity, isolation, idempotency. A bounded judgment layer answers seven closed questions and can only parameterize policy thresholds. We map the design to an iMessage/Photon ingress and an ACPs/AIP v2.2 Leader--Partner path, measure discovery and recommendation live, record a consent-gated invocation and its partner-side effect, and consult the judgment plane in advisory mode. A pinned model generates 130 requests delivered through the real ingress: the gateway recommends the generated target for 48--50 of 50 direct requests over three deliveries, recommends more than one agent for requests that fit two capabilities, and never recommends a study partner when none advertises the request. Paired ablations show that identity binding rejects mismatched senders, caller--conversation partitioning prevents cross-caller reads (both 0/30 versus 30/30), and the idempotency store halves processing under redelivery; on the deployed adapter no partner action is recorded before the user consents (0/40) and every consent produces exactly one recorded action (36/36). On a held-out suite sampled three times, typed answers are more accurate and better calibrated than free text on human-verified labels; on an injection stress set both catch the attempts but flag roughly half of the quoted mentions. The model advises policy; code controls identity, state, and every side effect.</w:t>
       </w:r>
     </w:p>
     <w:p>
@@ -2548,7 +2548,7 @@
         <w:rPr>
           <w:rFonts w:eastAsia="SimSun"/>
         </w:rPr>
-        <w:t xml:space="preserve"> Selection is read from the reply (§9.6), and the same requests are ranked through the discovery service as a cross-check.</w:t>
+        <w:t xml:space="preserve"> Selection is read from the reply: a name counts as a recommendation only when it leads a bullet in the reply's recommendation section, so names that appear only in the recall statistics or in the candidate list are excluded. The same requests are ranked through the discovery service as a cross-check.</w:t>
       </w:r>
     </w:p>
     <w:p>
@@ -2606,7 +2606,7 @@
         <w:rPr>
           <w:rFonts w:eastAsia="SimSun"/>
         </w:rPr>
-        <w:t xml:space="preserve"> Caller--conversation partitioning keeps one caller from reading another caller's pending state, and the event-level idempotency store keeps a redelivered event from re-entering processing; removing either restores the corresponding failure. Throughput is out of scope here; the gateway cost is measured component by component in §9.4.</w:t>
+        <w:t xml:space="preserve"> Caller--conversation partitioning keeps one caller from reading another caller's pending state, and the event-level idempotency store keeps a redelivered event from re-entering processing; removing either restores the corresponding failure. The gateway cost is measured component by component in §9.4.</w:t>
       </w:r>
     </w:p>
     <w:p>
@@ -2854,7 +2854,7 @@
         <w:rPr>
           <w:rFonts w:eastAsia="SimSun"/>
         </w:rPr>
-        <w:t>The pinned model generated 130 requests; each was delivered three times, in a fresh caller and conversation, through the deployed ingress and adapter. Selection was read from the reply with the rule of §9.6; the structured ranking was read once per request from the discovery service.</w:t>
+        <w:t>The pinned model generated 130 requests; each was delivered three times, in a fresh caller and conversation, through the deployed ingress and adapter. Selection was read from the reply with the rule of §6; the structured ranking was read once per request from the discovery service.</w:t>
       </w:r>
     </w:p>
     <w:p>
@@ -3746,7 +3746,7 @@
         <w:rPr>
           <w:rFonts w:eastAsia="SimSun"/>
         </w:rPr>
-        <w:t>, temperature 0, reasoning effort pinned low, no output-token cap) answered a 280-item suite split into 141 training, 77 development, and 62 held-out items by stable task hash; an empty reply is retried rather than scored. Labels were built from a latent variable, re-read blind by the same model with only the text, question, and options, and adjudicated on the 99 disagreements or uncertain items (60 changed, 15 unresolved); the full set was then verified by human review. Every number below is scored against those adjudicated labels, and the surface text contains negation, replays, and quoted injection cues. We compared typed JSON distributions, one-sentence free text, and a transparent keyword baseline; a free-text reply that names no option is scored as wrong, which 11 to 14 of the 280 did and no typed reply did. Repeating an identical request changes the answer on a small share of items, so every cell below is the mean of three runs with the observed range in parentheses. Pairwise answer agreement between runs is 95.2% for typed answers and 89.4% for free text.</w:t>
+        <w:t>, temperature 0, reasoning effort pinned low, no output-token cap) answered a 280-item suite split into 141 training, 77 development, and 62 held-out items by stable task hash; an empty reply is retried rather than scored. Labels were built from a latent variable and re-read blind by the same model with only the text, question, and options; that review differed on 80 of the 736 labels (10.9%) and was uncertain on 19 (2.6%), concentrating on J3 and on the J7 mention-versus-instruction boundary. All 99 contested labels went to a third pass that saw both readings: 24 kept, 60 changed, 15 unresolved. The final set was verified by human review. Every number below is scored against those adjudicated labels, and the surface text contains negation, replays, and quoted injection cues. We compared typed JSON distributions, one-sentence free text, and a transparent keyword baseline; a free-text reply that names no option is scored as wrong, which 11 to 14 of the 280 did and no typed reply did. Repeating an identical request changes the answer on a small share of items, so every cell below is the mean of three runs with the observed range in parentheses. Pairwise answer agreement between runs is 95.2% for typed answers and 89.4% for free text.</w:t>
       </w:r>
     </w:p>
     <w:p>
@@ -4597,7 +4597,7 @@
         <w:rPr>
           <w:rFonts w:eastAsia="SimSun"/>
         </w:rPr>
-        <w:t>Every result here comes from one deployment with one registry and one capability set. Selection is read from the assistant's reply, because the adapter exposes no structured decision record: the read is line-scoped, so a name counts only when it leads a bullet in the recommendation section, which excludes names that appear only in the recall statistics or the candidate list; selection is also cross-checked against the discovery ranking. The ablation arms are staging copies of the deployed code with one environment-gated change each, paired with a control built from the same copy; the consent and effect experiment runs on the deployed adapter. The endpoint is not deterministic, so the routing samples and each judgment suite were run three times. The judgment layer is measured on one hosted model, so it supports an answer-shape comparison on this suite. The final label set was verified by human review. The injection stress set is built from templates, so its phrasing is more regular than real traffic; all inputs are synthetic or model-generated and identifiers are pseudonymized.</w:t>
+        <w:t>Every result here comes from one deployment with one registry and one capability set; selection is read from the reply as described in §6 and cross-checked against the discovery ranking. The ablation arms are staging copies of the deployed code with one environment-gated change each, paired with a control built from the same copy, while the consent, effect, and advisory-judgment experiments run on the deployed adapter. The judgment layer is measured on one hosted model. The injection stress set is built from templates, so its phrasing is more regular than real traffic; all inputs are synthetic or model-generated, identifiers are pseudonymized, no outbound message is delivered, and no real user message body is used as a benchmark input or example.</w:t>
       </w:r>
     </w:p>
     <w:p>

</xml_diff>

<commit_message>
Cite the ACPs preprint and rewrite the ACPs description from the source paper (EN/ZH in step)
</commit_message>
<xml_diff>
--- a/paper/draft.docx
+++ b/paper/draft.docx
@@ -202,7 +202,7 @@
         <w:rPr>
           <w:rFonts w:eastAsia="SimSun"/>
         </w:rPr>
-        <w:t xml:space="preserve">Multi-agent evaluations often report final task accuracy without isolating discovery, authorization, identity, transport, state, and delivery: MAESTRO [16] provides a common runtime and framework-independent traces, and a companion study varies coordination patterns under fixed prompts, tools, and compute [13]. The prototype inspected here uses the Agent Collaboration Protocols (ACPs) stack, in which Agent Interaction Protocol (AIP) v2.2 defines the </w:t>
+        <w:t xml:space="preserve">Multi-agent evaluations often report final task accuracy without isolating discovery, authorization, identity, transport, state, and delivery: MAESTRO [17] provides a common runtime and framework-independent traces, and a companion study varies coordination patterns under fixed prompts, tools, and compute [13]. The prototype inspected here uses the Agent Collaboration Protocols (ACPs) stack, in which Agent Interaction Protocol (AIP) v2.2 defines the </w:t>
       </w:r>
       <w:r>
         <w:rPr>
@@ -241,7 +241,7 @@
         <w:rPr>
           <w:rFonts w:eastAsia="SimSun"/>
         </w:rPr>
-        <w:t>) [1]. Li et al. describe ACPs as a framework for onboarding, discovery, collaboration, and instrumentation in an Internet of Agents [14], and the open-source Leader and Partner processes used here implement those behaviors [1]. A user-facing transport is not an AIP caller, so the gateway is the translation boundary, and we take it as the unit of analysis. Interoperability is still being standardized rather than settled: a recent survey compares the Model Context Protocol, the Agent Communication Protocol, the Agent-to-Agent protocol, and the Agent Network Protocol, and finds overlapping scope with incompatible identity and discovery models [6]. The gateway therefore treats the protocol layer as one of several interchangeable back ends.</w:t>
+        <w:t>) [1]. Li et al. describe ACPs as a protocol suite for the Internet of Agents: registration (ARP), discovery (ADP), interaction (AIP), and tooling (ATP), extended by protocols for authenticated access and accounting and for agent management, and positioned against MCP's focus on tool invocation, A2A's on enterprise connectivity, and ANP's lack of access authentication and management [14, 15]. The open-source Leader and Partner processes used here implement those behaviors [1], and the suite's own roadmap leaves security mechanisms and multi-vendor validation to future work [15]. A user-facing transport is not an AIP caller, so the gateway is the translation boundary, and we take it as the unit of analysis. Interoperability is still being standardized rather than settled: a recent survey compares the Model Context Protocol, the Agent Communication Protocol, the Agent-to-Agent protocol, and the Agent Network Protocol, and finds overlapping scope with incompatible identity and discovery models [6]. The gateway therefore treats the protocol layer as one of several interchangeable back ends.</w:t>
       </w:r>
     </w:p>
     <w:p>
@@ -260,7 +260,7 @@
         <w:rPr>
           <w:rFonts w:eastAsia="SimSun"/>
         </w:rPr>
-        <w:t>Constraining a model's output space makes its answers checkable. Grammar-constrained decoding restricts generation to a formal language and improves structured tasks without fine-tuning [8], and format-restricted prompting changes accuracy relative to free text [20]. A decision model that returns only a closed label, a distribution over named options, or an ordinal score has a still smaller output space: the response cannot become a tool call, and thresholds, fallbacks, and effects stay in application code.</w:t>
+        <w:t>Constraining a model's output space makes its answers checkable. Grammar-constrained decoding restricts generation to a formal language and improves structured tasks without fine-tuning [8], and format-restricted prompting changes accuracy relative to free text [21]. A decision model that returns only a closed label, a distribution over named options, or an ordinal score has a still smaller output space: the response cannot become a tool call, and thresholds, fallbacks, and effects stay in application code.</w:t>
       </w:r>
     </w:p>
     <w:p>
@@ -268,7 +268,7 @@
         <w:rPr>
           <w:rFonts w:eastAsia="SimSun"/>
         </w:rPr>
-        <w:t>Two literatures explain why the surrounding policy needs abstention and calibration. Work on selective classification formalizes the coverage--risk trade-off and shows that a predictor should be able to decline when its confidence is low [7]; modern neural networks are often miscalibrated even when accurate, so confidence must be measured rather than assumed [10]. The adversarial case matters as much: prompt injection can redirect tool use in LLM-integrated applications [9], indirect injection hides the instruction inside content the application retrieves [15], and agent benchmarks show that current defenses leave substantial residual risk [4]. These results motivate a gateway that measures selective risk while keeping authorization outside the model.</w:t>
+        <w:t>Two literatures explain why the surrounding policy needs abstention and calibration. Work on selective classification formalizes the coverage--risk trade-off and shows that a predictor should be able to decline when its confidence is low [7]; modern neural networks are often miscalibrated even when accurate, so confidence must be measured rather than assumed [10]. The adversarial case matters as much: prompt injection can redirect tool use in LLM-integrated applications [9], indirect injection hides the instruction inside content the application retrieves [16], and agent benchmarks show that current defenses leave substantial residual risk [4]. These results motivate a gateway that measures selective risk while keeping authorization outside the model.</w:t>
       </w:r>
     </w:p>
     <w:p>
@@ -287,7 +287,7 @@
         <w:rPr>
           <w:rFonts w:eastAsia="SimSun"/>
         </w:rPr>
-        <w:t>Agent security has largely moved from detection to structural constraint. Benchmarks such as InjecAgent [24] and ToolEmu [17] show that tool-using agents can be steered into harmful actions by the content they retrieve, and StruQ [3] and CaMeL [5] answer this by controlling the path from untrusted text to the action space rather than by classifying the text itself. A parallel line places enforcement inside the runtime: Progent [19] attaches privilege constraints to individual tool calls, AgentSpec [21] and GuardAgent [23] compile and check runtime rules, and IsolateGPT [22] isolates each agent's execution. These systems constrain the agent from the inside; our setting instead puts the check at the boundary between a human messaging channel and the protocol, where the caller is a person and the first question is whether the request may be sent at all. That boundary also inherits older machinery: delegated authorization has established primitives [11], and selective prediction gives a principled way to decline when confidence is low [2, 7].</w:t>
+        <w:t>Agent security has largely moved from detection to structural constraint. Benchmarks such as InjecAgent [25] and ToolEmu [18] show that tool-using agents can be steered into harmful actions by the content they retrieve, and StruQ [3] and CaMeL [5] answer this by controlling the path from untrusted text to the action space rather than by classifying the text itself. A parallel line places enforcement inside the runtime: Progent [20] attaches privilege constraints to individual tool calls, AgentSpec [22] and GuardAgent [24] compile and check runtime rules, and IsolateGPT [23] isolates each agent's execution. These systems constrain the agent from the inside; our setting instead puts the check at the boundary between a human messaging channel and the protocol, where the caller is a person and the first question is whether the request may be sent at all. That boundary also inherits older machinery: delegated authorization has established primitives [11], and selective prediction gives a principled way to decline when confidence is low [2, 7].</w:t>
       </w:r>
     </w:p>
     <w:p>
@@ -386,7 +386,7 @@
         <w:rPr>
           <w:rFonts w:eastAsia="SimSun"/>
         </w:rPr>
-        <w:t xml:space="preserve"> one logical task produces at most one side effect for an idempotency key, including replayed ingress. The first two follow the classical complete-mediation and least-privilege principles [18]; the last is the idempotence requirement of distributed request handling [12].</w:t>
+        <w:t xml:space="preserve"> one logical task produces at most one side effect for an idempotency key, including replayed ingress. The first two follow the classical complete-mediation and least-privilege principles [19]; the last is the idempotence requirement of distributed request handling [12].</w:t>
       </w:r>
     </w:p>
     <w:p>
@@ -4961,6 +4961,17 @@
         <w:rPr>
           <w:rFonts w:eastAsia="SimSun"/>
         </w:rPr>
+        <w:t>J. Liu et al., "ACPs: Agent collaboration protocols for the Internet of Agents," arXiv:2505.13523, 2025.</w:t>
+      </w:r>
+    </w:p>
+    <w:p>
+      <w:pPr>
+        <w:pStyle w:val="ListNumber"/>
+      </w:pPr>
+      <w:r>
+        <w:rPr>
+          <w:rFonts w:eastAsia="SimSun"/>
+        </w:rPr>
         <w:t xml:space="preserve">Y. Liu et al., "Formalizing and benchmarking prompt injection attacks and defenses," in </w:t>
       </w:r>
       <w:r>

</xml_diff>

<commit_message>
Add the full author block (five authors, two affiliations, corresponding author) to the manuscript and builders
</commit_message>
<xml_diff>
--- a/paper/draft.docx
+++ b/paper/draft.docx
@@ -15,30 +15,36 @@
       </w:r>
     </w:p>
     <w:p>
-      <w:pPr>
-        <w:spacing w:after="20"/>
-        <w:jc w:val="center"/>
-      </w:pPr>
       <w:r>
         <w:rPr>
-          <w:rFonts w:ascii="Times New Roman" w:hAnsi="Times New Roman" w:eastAsia="SimSun"/>
           <w:b/>
-          <w:sz w:val="22"/>
+          <w:rFonts w:eastAsia="SimSun"/>
         </w:rPr>
-        <w:t>Yizhang Cai</w:t>
+        <w:t>Yizhang Cai, Jun Liu, Di Ma, Ke Yu, Ke Li</w:t>
       </w:r>
     </w:p>
     <w:p>
-      <w:pPr>
-        <w:spacing w:after="160"/>
-        <w:jc w:val="center"/>
-      </w:pPr>
       <w:r>
         <w:rPr>
-          <w:rFonts w:ascii="Times New Roman" w:hAnsi="Times New Roman" w:eastAsia="SimSun"/>
-          <w:sz w:val="19"/>
+          <w:rFonts w:eastAsia="SimSun"/>
         </w:rPr>
-        <w:t>School of Artificial Intelligence, Beijing University of Posts and Telecommunications, Beijing, China</w:t>
+        <w:t>Yizhang Cai, Jun Liu, Ke Yu, Ke Li: School of Artificial Intelligence, Beijing University of Posts and Telecommunications, Beijing, China</w:t>
+      </w:r>
+    </w:p>
+    <w:p>
+      <w:r>
+        <w:rPr>
+          <w:rFonts w:eastAsia="SimSun"/>
+        </w:rPr>
+        <w:t>Di Ma: Beijing Guoshu Zhilian Technology Co., Ltd., Beijing, China</w:t>
+      </w:r>
+    </w:p>
+    <w:p>
+      <w:r>
+        <w:rPr>
+          <w:rFonts w:eastAsia="SimSun"/>
+        </w:rPr>
+        <w:t>Emails: liujun@bupt.edu.cn; like1990@bupt.edu.cn (corresponding author); madi@guoshuzhilian.com.cn</w:t>
       </w:r>
     </w:p>
     <w:p>

</xml_diff>

<commit_message>
Switch first author email to 2025111259@bupt.cn; set A4 paper and trim keywords to six
</commit_message>
<xml_diff>
--- a/paper/draft.docx
+++ b/paper/draft.docx
@@ -44,7 +44,7 @@
         <w:rPr>
           <w:rFonts w:eastAsia="SimSun"/>
         </w:rPr>
-        <w:t>Emails: 1187800909@qq.com (Yizhang Cai); liujun@bupt.edu.cn (Jun Liu); yuke@bupt.edu.cn (Ke Yu); like1990@bupt.edu.cn (Ke Li, corresponding author); madi@guoshuzhilian.com.cn (Di Ma)</w:t>
+        <w:t>Emails: 2025111259@bupt.cn (Yizhang Cai); liujun@bupt.edu.cn (Jun Liu); yuke@bupt.edu.cn (Ke Yu); like1990@bupt.edu.cn (Ke Li, corresponding author); madi@guoshuzhilian.com.cn (Di Ma)</w:t>
       </w:r>
     </w:p>
     <w:p>
@@ -78,7 +78,7 @@
         <w:rPr>
           <w:rFonts w:eastAsia="SimSun"/>
         </w:rPr>
-        <w:t xml:space="preserve"> multi-agent systems; agent interconnection; messaging gateway; consent; identity binding; typed decision models; calibration; AIP; ACPs; reliability; security evaluation</w:t>
+        <w:t xml:space="preserve"> multi-agent systems; agent interconnection; messaging gateway; consent; typed decision models; calibration</w:t>
       </w:r>
     </w:p>
     <w:p>

</xml_diff>

<commit_message>
Minor revision for review: per-sample routing disagreement analysis, figure captions, Table 5 legend
</commit_message>
<xml_diff>
--- a/paper/draft.docx
+++ b/paper/draft.docx
@@ -1231,7 +1231,7 @@
         <w:drawing>
           <wp:inline xmlns:a="http://schemas.openxmlformats.org/drawingml/2006/main" xmlns:pic="http://schemas.openxmlformats.org/drawingml/2006/picture">
             <wp:extent cx="5806440" cy="4434009"/>
-            <wp:docPr id="1" name="Picture 1" descr="Fig. 1. Seven-module consent-gated gateway and the judgment plane" title="Fig. 1. Seven-module consent-gated gateway and the judgment plane"/>
+            <wp:docPr id="1" name="Picture 1" descr="Fig. 1. Seven-module consent-gated gateway and the judgment plane. A message enters on the iMessage/Photon ingress (M1), is authenticated and normalised, and is partitioned by caller and conversation (M2); discovery returns eligible candidates for the capability query (M3). The judgment plane supplies J1/J2 routing labels and J3/J4 consent labels while thresholds and branches stay in code. An accepted event passes consent (M4), binds the candidate AIC to its endpoint in execution (M5), keeps keys and context in state (M6), and replies from delivery (M7)." title="Fig. 1. Seven-module consent-gated gateway and the judgment plane. A message enters on the iMessage/Photon ingress (M1), is authenticated and normalised, and is partitioned by caller and conversation (M2); discovery returns eligible candidates for the capability query (M3). The judgment plane supplies J1/J2 routing labels and J3/J4 consent labels while thresholds and branches stay in code. An accepted event passes consent (M4), binds the candidate AIC to its endpoint in execution (M5), keeps keys and context in state (M6), and replies from delivery (M7)."/>
             <wp:cNvGraphicFramePr>
               <a:graphicFrameLocks noChangeAspect="1"/>
             </wp:cNvGraphicFramePr>
@@ -1272,7 +1272,7 @@
           <w:rFonts w:ascii="Times New Roman" w:hAnsi="Times New Roman" w:eastAsia="SimSun"/>
           <w:sz w:val="18"/>
         </w:rPr>
-        <w:t>Fig. 1. Seven-module consent-gated gateway and the judgment plane</w:t>
+        <w:t>Fig. 1. Seven-module consent-gated gateway and the judgment plane. A message enters on the iMessage/Photon ingress (M1), is authenticated and normalised, and is partitioned by caller and conversation (M2); discovery returns eligible candidates for the capability query (M3). The judgment plane supplies J1/J2 routing labels and J3/J4 consent labels while thresholds and branches stay in code. An accepted event passes consent (M4), binds the candidate AIC to its endpoint in execution (M5), keeps keys and context in state (M6), and replies from delivery (M7).</w:t>
       </w:r>
     </w:p>
     <w:p>
@@ -2084,7 +2084,7 @@
         <w:drawing>
           <wp:inline xmlns:a="http://schemas.openxmlformats.org/drawingml/2006/main" xmlns:pic="http://schemas.openxmlformats.org/drawingml/2006/picture">
             <wp:extent cx="5806440" cy="5093368"/>
-            <wp:docPr id="2" name="Picture 2" descr="Fig. 2. Reference gateway processing flow" title="Fig. 2. Reference gateway processing flow"/>
+            <wp:docPr id="2" name="Picture 2" descr="Fig. 2. Reference gateway processing flow. Context resolution binds caller and conversation, deduplicates the event, and queries discovery, so a cached event returns its stored reply without a new call. Policy checks the route, consent, and cancellation, and a pending decision returns to the caller and re-enters at authentication when the user answers. Endpoint validation binds the AIC to the endpoint and mTLS identity before execution; a failure reaches the retry classifier, which re-enters only when the failure is retryable, replay-safe, and within budget." title="Fig. 2. Reference gateway processing flow. Context resolution binds caller and conversation, deduplicates the event, and queries discovery, so a cached event returns its stored reply without a new call. Policy checks the route, consent, and cancellation, and a pending decision returns to the caller and re-enters at authentication when the user answers. Endpoint validation binds the AIC to the endpoint and mTLS identity before execution; a failure reaches the retry classifier, which re-enters only when the failure is retryable, replay-safe, and within budget."/>
             <wp:cNvGraphicFramePr>
               <a:graphicFrameLocks noChangeAspect="1"/>
             </wp:cNvGraphicFramePr>
@@ -2125,7 +2125,7 @@
           <w:rFonts w:ascii="Times New Roman" w:hAnsi="Times New Roman" w:eastAsia="SimSun"/>
           <w:sz w:val="18"/>
         </w:rPr>
-        <w:t>Fig. 2. Reference gateway processing flow</w:t>
+        <w:t>Fig. 2. Reference gateway processing flow. Context resolution binds caller and conversation, deduplicates the event, and queries discovery, so a cached event returns its stored reply without a new call. Policy checks the route, consent, and cancellation, and a pending decision returns to the caller and re-enters at authentication when the user answers. Endpoint validation binds the AIC to the endpoint and mTLS identity before execution; a failure reaches the retry classifier, which re-enters only when the failure is retryable, replay-safe, and within budget.</w:t>
       </w:r>
     </w:p>
     <w:p>
@@ -2817,7 +2817,7 @@
         <w:rPr>
           <w:rFonts w:eastAsia="SimSun"/>
         </w:rPr>
-        <w:t xml:space="preserve">The artifact contains the request suites, per-sample routing and consent outcomes, the advisory judgment log, the ablation builds with their controls, the judgment suites with cached responses and per-item predictions, and reproduction commands; the package is at </w:t>
+        <w:t xml:space="preserve">The artifact contains the request suites, per-sample routing and consent outcomes, the advisory judgment log, the ablation builds with their controls, and the judgment suites with cached predictions; the package is at </w:t>
       </w:r>
       <w:r>
         <w:rPr>
@@ -3284,7 +3284,7 @@
         <w:rPr>
           <w:rFonts w:eastAsia="SimSun"/>
         </w:rPr>
-        <w:t>Table 4 gives the per-class counts. The path recommended the generated target for 48, 48, and 50 of the 50 direct requests (96--100%) and never recommended a different study partner; the misses recommended only agents outside the study set. The 48/50 delivery carries a 95% Wilson interval of [86.5%, 98.9%], and the 39/40 delivery [87.1%, 99.6%]. For requests that fit two capabilities it recommended more than one agent in 39, 38, and 38 of 40 and never asked for clarification; whether the combination covers the request was not adjudicated. The gateway makes no abstention decision of its own: it presents what the discovery index returns and leaves acceptance to the user. For requests no study partner advertises, that design shows up as follows: no study partner was recommended in any of the three deliveries, while the index returned a candidate for 36 of the 40 requests and the replies named a public-registry agent in all 40. The structured instrument was weaker: read once, discovery ranked the target first for 40 of 50 and inside the top three for 48. The instruments agreed on 42 of 50: the reply found eight targets discovery did not rank first, and discovery never ranked the target first while the reply missed it. Eighteen of the 130 samples changed outcome between deliveries, seven of them direct. The results are consistent with H1 at the level of recommendation.</w:t>
+        <w:t>Table 4 gives the per-class counts. The path recommended the generated target for 48, 48, and 50 of the 50 direct requests (96--100%) and never recommended a different study partner; the misses recommended only agents outside the study set. The 48/50 delivery carries a 95% Wilson interval of [86.5%, 98.9%], and the 39/40 delivery [87.1%, 99.6%]. For requests that fit two capabilities it recommended more than one agent in 39, 38, and 38 of 40 and never asked for clarification; whether the combination covers the request was not adjudicated. The gateway makes no abstention decision of its own: it presents what the discovery index returns and leaves acceptance to the user. For requests no study partner advertises, that design shows up as follows: no study partner was recommended in any of the three deliveries, while the index returned a candidate for 36 of the 40 requests and the replies named a public-registry agent in all 40. The structured instrument was weaker: read once, discovery ranked the target first for 40 of 50 and inside the top three for 48. The instruments agreed on 42 of 50, and the disagreement is one-sided: discovery never ranked the target first in a case where the reply missed it. Of the eight reply-only selections in the first delivery, six sit at ranks two or three and two outside its top three: where the instruments differ, the reply re-orders or extends the same pool rather than substituting another. Eighteen of the 130 samples changed outcome between deliveries, seven of them direct. The results are consistent with H1 at the level of recommendation.</w:t>
       </w:r>
     </w:p>
     <w:p>
@@ -3310,7 +3310,7 @@
         <w:rPr>
           <w:rFonts w:eastAsia="SimSun"/>
         </w:rPr>
-        <w:t xml:space="preserve"> Ablation arms against same-code controls. Ports list the ablation instance, its same-code control, and, where the arm was also probed on the deployment, the live instance.</w:t>
+        <w:t xml:space="preserve"> Ablation arms against same-code controls. Ports are read as ablation / same-code control / live instance, where the live instance appears only for arms that were also probed on the deployment.</w:t>
       </w:r>
     </w:p>
     <w:tbl>
@@ -3368,7 +3368,7 @@
                 <w:sz w:val="17"/>
                 <w:rFonts w:eastAsia="SimSun"/>
               </w:rPr>
-              <w:t>Port</w:t>
+              <w:t>Ports (abl./ctrl./live)</w:t>
             </w:r>
           </w:p>
         </w:tc>
@@ -4603,7 +4603,7 @@
         <w:rPr>
           <w:rFonts w:eastAsia="SimSun"/>
         </w:rPr>
-        <w:t>Every result here comes from one deployment with one registry and one capability set; selection is read from the reply as described in §6 and cross-checked against the discovery ranking. The ablation arms are staging copies of the deployed code with one environment-gated change each, paired with a control built from the same copy, while the consent, effect, and advisory-judgment experiments run on the deployed adapter. The judgment layer is measured on one hosted model. The injection stress set is built from templates, so its phrasing is more regular than real traffic; all inputs are synthetic or model-generated, identifiers are pseudonymized, no outbound message is delivered, and no real user message body is used as a benchmark input or example.</w:t>
+        <w:t>Every result here comes from one deployment with one registry and one capability set; selection is read from the reply as described in §6 and cross-checked against the discovery ranking. The ablation arms are staging copies of the deployed code with one environment-gated change each, paired with a control built from the same copy, while the consent, effect, and advisory-judgment experiments run on the deployed adapter. The judgment layer is measured on one hosted model. The injection stress set is built from templates; all inputs are synthetic or model-generated, identifiers are pseudonymized, and no outbound message is delivered.</w:t>
       </w:r>
     </w:p>
     <w:p>
@@ -4622,7 +4622,7 @@
         <w:rPr>
           <w:rFonts w:eastAsia="SimSun"/>
         </w:rPr>
-        <w:t>This paper separates typed judgment from deterministic enforcement in a seven-module message-to-agent gateway and tests the boundary on a deployed iMessage/ACPs path. The deployed path recommends the generated target, composes a plan when a request fits two capabilities, and never recommends a study partner when none advertises the request. Paired ablations show that the sender-to-peer assertion, the caller--conversation partition, and the event-level idempotency store each carry their invariant. On the deployed adapter the consent gate admits exactly one partner action per accepted event and admits none before the user agrees. The judgment layer is more accurate and better calibrated in its typed form, while its injection score over-triggers on quoted text, which is why it only parameterizes policy. The measurements cover one deployment and one capability set.</w:t>
+        <w:t>This paper separates typed judgment from deterministic enforcement in a seven-module message-to-agent gateway and tests the boundary on a deployed iMessage/ACPs path. The deployed path recommends the generated target, composes a plan when a request fits two capabilities, and never recommends a study partner when none advertises the request. Paired ablations show that the sender-to-peer assertion, the caller--conversation partition, and the event-level idempotency store each carry their invariant. On the deployed adapter the consent gate admits exactly one partner action per accepted event and admits none before the user agrees. The judgment layer is more accurate and better calibrated in its typed form, while its injection score over-triggers on quoted text, which is why it only parameterizes policy.</w:t>
       </w:r>
     </w:p>
     <w:p>

</xml_diff>